<commit_message>
feat (TR): lab 2 make a first algorithm, fill in the report for it
</commit_message>
<xml_diff>
--- a/42TR Tehnologiji Rozpodilenyh System/2/TR_KNT-122_Onyshchenko_19_PR2.docx
+++ b/42TR Tehnologiji Rozpodilenyh System/2/TR_KNT-122_Onyshchenko_19_PR2.docx
@@ -524,27 +524,2395 @@
       </w:pPr>
       <w:r>
         <w:rPr/>
+        <w:t xml:space="preserve">1 </w:t>
+      </w:r>
+      <w:r>
+        <w:rPr/>
         <w:t>Графи алгоритмів</w:t>
       </w:r>
     </w:p>
     <w:p>
       <w:pPr>
+        <w:pStyle w:val="H3"/>
+        <w:rPr/>
+      </w:pPr>
+      <w:r>
+        <w:rPr/>
+        <w:t>Бінарний модуль</w:t>
+      </w:r>
+    </w:p>
+    <w:p>
+      <w:pPr>
+        <w:pStyle w:val="P1"/>
+        <w:rPr/>
+      </w:pPr>
+      <w:r>
+        <w:rPr/>
+      </w:r>
+    </w:p>
+    <w:p>
+      <w:pPr>
+        <w:pStyle w:val="img1"/>
+        <w:rPr/>
+      </w:pPr>
+      <w:r>
+        <w:rPr/>
+        <w:drawing>
+          <wp:inline distT="0" distB="0" distL="0" distR="0">
+            <wp:extent cx="3571875" cy="7829550"/>
+            <wp:effectExtent l="0" t="0" r="0" b="0"/>
+            <wp:docPr id="1" name="Зображення1"/>
+            <wp:cNvGraphicFramePr>
+              <a:graphicFrameLocks xmlns:a="http://schemas.openxmlformats.org/drawingml/2006/main" noChangeAspect="1"/>
+            </wp:cNvGraphicFramePr>
+            <a:graphic xmlns:a="http://schemas.openxmlformats.org/drawingml/2006/main">
+              <a:graphicData uri="http://schemas.openxmlformats.org/drawingml/2006/picture">
+                <pic:pic xmlns:pic="http://schemas.openxmlformats.org/drawingml/2006/picture">
+                  <pic:nvPicPr>
+                    <pic:cNvPr id="1" name="Зображення1"/>
+                    <pic:cNvPicPr>
+                      <a:picLocks noChangeAspect="1" noChangeArrowheads="1"/>
+                    </pic:cNvPicPr>
+                  </pic:nvPicPr>
+                  <pic:blipFill>
+                    <a:blip r:embed="rId2">
+                      <a:extLst>
+                        <a:ext uri="{96DAC541-7B7A-43D3-8B79-37D633B846F1}">
+                          <asvg:svgBlip xmlns:asvg="http://schemas.microsoft.com/office/drawing/2016/SVG/main" r:embed="rId3"/>
+                        </a:ext>
+                      </a:extLst>
+                    </a:blip>
+                    <a:stretch>
+                      <a:fillRect/>
+                    </a:stretch>
+                  </pic:blipFill>
+                  <pic:spPr bwMode="auto">
+                    <a:xfrm>
+                      <a:off x="0" y="0"/>
+                      <a:ext cx="3571875" cy="7829550"/>
+                    </a:xfrm>
+                    <a:prstGeom prst="rect">
+                      <a:avLst/>
+                    </a:prstGeom>
+                    <a:noFill/>
+                  </pic:spPr>
+                </pic:pic>
+              </a:graphicData>
+            </a:graphic>
+          </wp:inline>
+        </w:drawing>
+      </w:r>
+    </w:p>
+    <w:p>
+      <w:pPr>
+        <w:pStyle w:val="img1"/>
+        <w:rPr/>
+      </w:pPr>
+      <w:r>
+        <w:rPr/>
+        <w:t>Рисунок 1.1 — Блок-схема алгоритму</w:t>
+      </w:r>
+    </w:p>
+    <w:p>
+      <w:pPr>
+        <w:pStyle w:val="P1"/>
+        <w:rPr/>
+      </w:pPr>
+      <w:r>
+        <w:rPr/>
+      </w:r>
+    </w:p>
+    <w:p>
+      <w:pPr>
+        <w:pStyle w:val="H3"/>
+        <w:rPr/>
+      </w:pPr>
+      <w:bookmarkStart w:id="0" w:name="__RefHeading___Toc1130_792013498"/>
+      <w:bookmarkEnd w:id="0"/>
+      <w:r>
+        <w:rPr/>
+        <w:t>Двухпоточний Монтгомері</w:t>
+      </w:r>
+    </w:p>
+    <w:p>
+      <w:pPr>
+        <w:pStyle w:val="H3"/>
+        <w:rPr/>
+      </w:pPr>
+      <w:r>
+        <w:rPr/>
+        <w:t>Метод гребеня</w:t>
+      </w:r>
+    </w:p>
+    <w:p>
+      <w:pPr>
+        <w:pStyle w:val="P1"/>
+        <w:rPr/>
+      </w:pPr>
+      <w:r>
+        <w:rPr/>
+      </w:r>
+    </w:p>
+    <w:p>
+      <w:pPr>
         <w:pStyle w:val="H2"/>
         <w:rPr/>
       </w:pPr>
       <w:r>
         <w:rPr/>
+        <w:t xml:space="preserve">2 </w:t>
+      </w:r>
+      <w:r>
+        <w:rPr/>
         <w:t>Тексти програми</w:t>
       </w:r>
     </w:p>
     <w:p>
       <w:pPr>
+        <w:pStyle w:val="H3"/>
+        <w:rPr/>
+      </w:pPr>
+      <w:r>
+        <w:rPr/>
+        <w:t>Бінарний модуль</w:t>
+      </w:r>
+    </w:p>
+    <w:p>
+      <w:pPr>
+        <w:pStyle w:val="H41"/>
+        <w:rPr/>
+      </w:pPr>
+      <w:r>
+        <w:rPr>
+          <w:lang w:val="en-US"/>
+        </w:rPr>
+        <w:t>m</w:t>
+      </w:r>
+      <w:r>
+        <w:rPr/>
+        <w:t>ain.ts</w:t>
+      </w:r>
+    </w:p>
+    <w:p>
+      <w:pPr>
+        <w:pStyle w:val="P1"/>
+        <w:rPr/>
+      </w:pPr>
+      <w:r>
+        <w:rPr/>
+      </w:r>
+    </w:p>
+    <w:p>
+      <w:pPr>
+        <w:pStyle w:val="Code"/>
+        <w:rPr/>
+      </w:pPr>
+      <w:r>
+        <w:rPr/>
+        <w:t>export const powerModular = (a: number, n: number, m: number): number =&gt; {</w:t>
+      </w:r>
+    </w:p>
+    <w:p>
+      <w:pPr>
+        <w:pStyle w:val="Code"/>
+        <w:rPr/>
+      </w:pPr>
+      <w:r>
+        <w:rPr/>
+        <w:t xml:space="preserve">  </w:t>
+      </w:r>
+      <w:r>
+        <w:rPr/>
+        <w:t>/*</w:t>
+      </w:r>
+    </w:p>
+    <w:p>
+      <w:pPr>
+        <w:pStyle w:val="Code"/>
+        <w:rPr/>
+      </w:pPr>
+      <w:r>
+        <w:rPr/>
+        <w:t xml:space="preserve">   </w:t>
+      </w:r>
+      <w:r>
+        <w:rPr/>
+        <w:t>* Обчислює (a^e)%m за допомогою бінарного методу.</w:t>
+      </w:r>
+    </w:p>
+    <w:p>
+      <w:pPr>
+        <w:pStyle w:val="Code"/>
+        <w:rPr/>
+      </w:pPr>
+      <w:r>
+        <w:rPr/>
+        <w:t xml:space="preserve">   </w:t>
+      </w:r>
+      <w:r>
+        <w:rPr/>
+        <w:t>*</w:t>
+      </w:r>
+    </w:p>
+    <w:p>
+      <w:pPr>
+        <w:pStyle w:val="Code"/>
+        <w:rPr/>
+      </w:pPr>
+      <w:r>
+        <w:rPr/>
+        <w:t xml:space="preserve">   </w:t>
+      </w:r>
+      <w:r>
+        <w:rPr/>
+        <w:t>* @param a: основа, base</w:t>
+      </w:r>
+    </w:p>
+    <w:p>
+      <w:pPr>
+        <w:pStyle w:val="Code"/>
+        <w:rPr/>
+      </w:pPr>
+      <w:r>
+        <w:rPr/>
+        <w:t xml:space="preserve">   </w:t>
+      </w:r>
+      <w:r>
+        <w:rPr/>
+        <w:t>* @param n: ступінь, exponent</w:t>
+      </w:r>
+    </w:p>
+    <w:p>
+      <w:pPr>
+        <w:pStyle w:val="Code"/>
+        <w:rPr/>
+      </w:pPr>
+      <w:r>
+        <w:rPr/>
+        <w:t xml:space="preserve">   </w:t>
+      </w:r>
+      <w:r>
+        <w:rPr/>
+        <w:t>* @param m: модуль, modulus</w:t>
+      </w:r>
+    </w:p>
+    <w:p>
+      <w:pPr>
+        <w:pStyle w:val="Code"/>
+        <w:rPr/>
+      </w:pPr>
+      <w:r>
+        <w:rPr/>
+        <w:t xml:space="preserve">   </w:t>
+      </w:r>
+      <w:r>
+        <w:rPr/>
+        <w:t>*/</w:t>
+      </w:r>
+    </w:p>
+    <w:p>
+      <w:pPr>
+        <w:pStyle w:val="Code"/>
+        <w:rPr/>
+      </w:pPr>
+      <w:r>
+        <w:rPr/>
+      </w:r>
+    </w:p>
+    <w:p>
+      <w:pPr>
+        <w:pStyle w:val="Code"/>
+        <w:rPr/>
+      </w:pPr>
+      <w:r>
+        <w:rPr/>
+        <w:t xml:space="preserve">  </w:t>
+      </w:r>
+      <w:r>
+        <w:rPr/>
+        <w:t>if (m === 1) return 0;</w:t>
+      </w:r>
+    </w:p>
+    <w:p>
+      <w:pPr>
+        <w:pStyle w:val="Code"/>
+        <w:rPr/>
+      </w:pPr>
+      <w:r>
+        <w:rPr/>
+        <w:t xml:space="preserve">  </w:t>
+      </w:r>
+      <w:r>
+        <w:rPr/>
+        <w:t>let result: number = 1;</w:t>
+      </w:r>
+    </w:p>
+    <w:p>
+      <w:pPr>
+        <w:pStyle w:val="Code"/>
+        <w:rPr/>
+      </w:pPr>
+      <w:r>
+        <w:rPr/>
+        <w:t xml:space="preserve">  </w:t>
+      </w:r>
+      <w:r>
+        <w:rPr/>
+        <w:t>a = a % m;</w:t>
+      </w:r>
+    </w:p>
+    <w:p>
+      <w:pPr>
+        <w:pStyle w:val="Code"/>
+        <w:rPr/>
+      </w:pPr>
+      <w:r>
+        <w:rPr/>
+      </w:r>
+    </w:p>
+    <w:p>
+      <w:pPr>
+        <w:pStyle w:val="Code"/>
+        <w:rPr/>
+      </w:pPr>
+      <w:r>
+        <w:rPr/>
+        <w:t xml:space="preserve">  </w:t>
+      </w:r>
+      <w:r>
+        <w:rPr/>
+        <w:t>while (n &gt; 0) {</w:t>
+      </w:r>
+    </w:p>
+    <w:p>
+      <w:pPr>
+        <w:pStyle w:val="Code"/>
+        <w:rPr/>
+      </w:pPr>
+      <w:r>
+        <w:rPr/>
+        <w:t xml:space="preserve">    </w:t>
+      </w:r>
+      <w:r>
+        <w:rPr/>
+        <w:t>if (n % 2 === 1) result = (result * a) % m;</w:t>
+      </w:r>
+    </w:p>
+    <w:p>
+      <w:pPr>
+        <w:pStyle w:val="Code"/>
+        <w:rPr/>
+      </w:pPr>
+      <w:r>
+        <w:rPr/>
+        <w:t xml:space="preserve">    </w:t>
+      </w:r>
+      <w:r>
+        <w:rPr/>
+        <w:t>n = Math.floor(n / 2);</w:t>
+      </w:r>
+    </w:p>
+    <w:p>
+      <w:pPr>
+        <w:pStyle w:val="Code"/>
+        <w:rPr/>
+      </w:pPr>
+      <w:r>
+        <w:rPr/>
+        <w:t xml:space="preserve">    </w:t>
+      </w:r>
+      <w:r>
+        <w:rPr/>
+        <w:t>a = (a * a) % m;</w:t>
+      </w:r>
+    </w:p>
+    <w:p>
+      <w:pPr>
+        <w:pStyle w:val="Code"/>
+        <w:rPr/>
+      </w:pPr>
+      <w:r>
+        <w:rPr/>
+        <w:t xml:space="preserve">  </w:t>
+      </w:r>
+      <w:r>
+        <w:rPr/>
+        <w:t>}</w:t>
+      </w:r>
+    </w:p>
+    <w:p>
+      <w:pPr>
+        <w:pStyle w:val="Code"/>
+        <w:rPr/>
+      </w:pPr>
+      <w:r>
+        <w:rPr/>
+      </w:r>
+    </w:p>
+    <w:p>
+      <w:pPr>
+        <w:pStyle w:val="Code"/>
+        <w:rPr/>
+      </w:pPr>
+      <w:r>
+        <w:rPr/>
+        <w:t xml:space="preserve">  </w:t>
+      </w:r>
+      <w:r>
+        <w:rPr/>
+        <w:t>return result;</w:t>
+      </w:r>
+    </w:p>
+    <w:p>
+      <w:pPr>
+        <w:pStyle w:val="Code"/>
+        <w:rPr/>
+      </w:pPr>
+      <w:r>
+        <w:rPr/>
+        <w:t>};</w:t>
+      </w:r>
+    </w:p>
+    <w:p>
+      <w:pPr>
+        <w:pStyle w:val="P1"/>
+        <w:rPr/>
+      </w:pPr>
+      <w:r>
+        <w:rPr/>
+      </w:r>
+    </w:p>
+    <w:p>
+      <w:pPr>
+        <w:pStyle w:val="H41"/>
+        <w:rPr/>
+      </w:pPr>
+      <w:r>
+        <w:rPr/>
+        <w:t>page.tsx</w:t>
+      </w:r>
+    </w:p>
+    <w:p>
+      <w:pPr>
+        <w:pStyle w:val="P1"/>
+        <w:rPr>
+          <w:lang w:val="en-US"/>
+        </w:rPr>
+      </w:pPr>
+      <w:r>
+        <w:rPr>
+          <w:lang w:val="en-US"/>
+        </w:rPr>
+      </w:r>
+    </w:p>
+    <w:p>
+      <w:pPr>
+        <w:pStyle w:val="Code"/>
+        <w:rPr>
+          <w:rFonts w:ascii="Courier New" w:hAnsi="Courier New"/>
+        </w:rPr>
+      </w:pPr>
+      <w:r>
+        <w:rPr>
+          <w:rFonts w:ascii="Courier New" w:hAnsi="Courier New"/>
+        </w:rPr>
+        <w:t>"use client";</w:t>
+      </w:r>
+    </w:p>
+    <w:p>
+      <w:pPr>
+        <w:pStyle w:val="Code"/>
+        <w:rPr>
+          <w:rFonts w:ascii="Courier New" w:hAnsi="Courier New"/>
+        </w:rPr>
+      </w:pPr>
+      <w:r>
+        <w:rPr>
+          <w:rFonts w:ascii="Courier New" w:hAnsi="Courier New"/>
+        </w:rPr>
+      </w:r>
+    </w:p>
+    <w:p>
+      <w:pPr>
+        <w:pStyle w:val="Code"/>
+        <w:rPr>
+          <w:rFonts w:ascii="Courier New" w:hAnsi="Courier New"/>
+        </w:rPr>
+      </w:pPr>
+      <w:r>
+        <w:rPr>
+          <w:rFonts w:ascii="Courier New" w:hAnsi="Courier New"/>
+        </w:rPr>
+        <w:t>import { powerModular } from "@/helper/main";</w:t>
+      </w:r>
+    </w:p>
+    <w:p>
+      <w:pPr>
+        <w:pStyle w:val="Code"/>
+        <w:rPr>
+          <w:rFonts w:ascii="Courier New" w:hAnsi="Courier New"/>
+        </w:rPr>
+      </w:pPr>
+      <w:r>
+        <w:rPr>
+          <w:rFonts w:ascii="Courier New" w:hAnsi="Courier New"/>
+        </w:rPr>
+        <w:t>import { FormEvent, useState } from "react";</w:t>
+      </w:r>
+    </w:p>
+    <w:p>
+      <w:pPr>
+        <w:pStyle w:val="Code"/>
+        <w:rPr>
+          <w:rFonts w:ascii="Courier New" w:hAnsi="Courier New"/>
+        </w:rPr>
+      </w:pPr>
+      <w:r>
+        <w:rPr>
+          <w:rFonts w:ascii="Courier New" w:hAnsi="Courier New"/>
+        </w:rPr>
+      </w:r>
+    </w:p>
+    <w:p>
+      <w:pPr>
+        <w:pStyle w:val="Code"/>
+        <w:rPr>
+          <w:rFonts w:ascii="Courier New" w:hAnsi="Courier New"/>
+        </w:rPr>
+      </w:pPr>
+      <w:r>
+        <w:rPr>
+          <w:rFonts w:ascii="Courier New" w:hAnsi="Courier New"/>
+        </w:rPr>
+        <w:t>export default function Home() {</w:t>
+      </w:r>
+    </w:p>
+    <w:p>
+      <w:pPr>
+        <w:pStyle w:val="Code"/>
+        <w:rPr>
+          <w:rFonts w:ascii="Courier New" w:hAnsi="Courier New"/>
+        </w:rPr>
+      </w:pPr>
+      <w:r>
+        <w:rPr>
+          <w:rFonts w:ascii="Courier New" w:hAnsi="Courier New"/>
+        </w:rPr>
+        <w:t xml:space="preserve">  </w:t>
+      </w:r>
+      <w:r>
+        <w:rPr>
+          <w:rFonts w:ascii="Courier New" w:hAnsi="Courier New"/>
+          <w:sz w:val="21"/>
+        </w:rPr>
+        <w:t>const [result, setResult] = useState(0);</w:t>
+      </w:r>
+    </w:p>
+    <w:p>
+      <w:pPr>
+        <w:pStyle w:val="Code"/>
+        <w:rPr>
+          <w:rFonts w:ascii="Courier New" w:hAnsi="Courier New"/>
+        </w:rPr>
+      </w:pPr>
+      <w:r>
+        <w:rPr>
+          <w:rFonts w:ascii="Courier New" w:hAnsi="Courier New"/>
+        </w:rPr>
+      </w:r>
+    </w:p>
+    <w:p>
+      <w:pPr>
+        <w:pStyle w:val="Code"/>
+        <w:rPr>
+          <w:rFonts w:ascii="Courier New" w:hAnsi="Courier New"/>
+        </w:rPr>
+      </w:pPr>
+      <w:r>
+        <w:rPr>
+          <w:rFonts w:ascii="Courier New" w:hAnsi="Courier New"/>
+        </w:rPr>
+        <w:t xml:space="preserve">  </w:t>
+      </w:r>
+      <w:r>
+        <w:rPr>
+          <w:rFonts w:ascii="Courier New" w:hAnsi="Courier New"/>
+          <w:sz w:val="21"/>
+        </w:rPr>
+        <w:t>const [base, setBase] = useState(0);</w:t>
+      </w:r>
+    </w:p>
+    <w:p>
+      <w:pPr>
+        <w:pStyle w:val="Code"/>
+        <w:rPr>
+          <w:rFonts w:ascii="Courier New" w:hAnsi="Courier New"/>
+        </w:rPr>
+      </w:pPr>
+      <w:r>
+        <w:rPr>
+          <w:rFonts w:ascii="Courier New" w:hAnsi="Courier New"/>
+        </w:rPr>
+        <w:t xml:space="preserve">  </w:t>
+      </w:r>
+      <w:r>
+        <w:rPr>
+          <w:rFonts w:ascii="Courier New" w:hAnsi="Courier New"/>
+          <w:sz w:val="21"/>
+        </w:rPr>
+        <w:t>const [exponent, setExponent] = useState(0);</w:t>
+      </w:r>
+    </w:p>
+    <w:p>
+      <w:pPr>
+        <w:pStyle w:val="Code"/>
+        <w:rPr>
+          <w:rFonts w:ascii="Courier New" w:hAnsi="Courier New"/>
+        </w:rPr>
+      </w:pPr>
+      <w:r>
+        <w:rPr>
+          <w:rFonts w:ascii="Courier New" w:hAnsi="Courier New"/>
+        </w:rPr>
+        <w:t xml:space="preserve">  </w:t>
+      </w:r>
+      <w:r>
+        <w:rPr>
+          <w:rFonts w:ascii="Courier New" w:hAnsi="Courier New"/>
+          <w:sz w:val="21"/>
+        </w:rPr>
+        <w:t>const [modulus, setModulus] = useState(0);</w:t>
+      </w:r>
+    </w:p>
+    <w:p>
+      <w:pPr>
+        <w:pStyle w:val="Code"/>
+        <w:rPr>
+          <w:rFonts w:ascii="Courier New" w:hAnsi="Courier New"/>
+        </w:rPr>
+      </w:pPr>
+      <w:r>
+        <w:rPr>
+          <w:rFonts w:ascii="Courier New" w:hAnsi="Courier New"/>
+        </w:rPr>
+      </w:r>
+    </w:p>
+    <w:p>
+      <w:pPr>
+        <w:pStyle w:val="Code"/>
+        <w:rPr>
+          <w:rFonts w:ascii="Courier New" w:hAnsi="Courier New"/>
+        </w:rPr>
+      </w:pPr>
+      <w:r>
+        <w:rPr>
+          <w:rFonts w:ascii="Courier New" w:hAnsi="Courier New"/>
+        </w:rPr>
+        <w:t xml:space="preserve">  </w:t>
+      </w:r>
+      <w:r>
+        <w:rPr>
+          <w:rFonts w:ascii="Courier New" w:hAnsi="Courier New"/>
+          <w:sz w:val="21"/>
+        </w:rPr>
+        <w:t>const handleSubmit = (e: FormEvent) =&gt; {</w:t>
+      </w:r>
+    </w:p>
+    <w:p>
+      <w:pPr>
+        <w:pStyle w:val="Code"/>
+        <w:rPr>
+          <w:rFonts w:ascii="Courier New" w:hAnsi="Courier New"/>
+        </w:rPr>
+      </w:pPr>
+      <w:r>
+        <w:rPr>
+          <w:rFonts w:ascii="Courier New" w:hAnsi="Courier New"/>
+        </w:rPr>
+        <w:t xml:space="preserve">    </w:t>
+      </w:r>
+      <w:r>
+        <w:rPr>
+          <w:rFonts w:ascii="Courier New" w:hAnsi="Courier New"/>
+          <w:sz w:val="21"/>
+        </w:rPr>
+        <w:t>e.preventDefault();</w:t>
+      </w:r>
+    </w:p>
+    <w:p>
+      <w:pPr>
+        <w:pStyle w:val="Code"/>
+        <w:rPr>
+          <w:rFonts w:ascii="Courier New" w:hAnsi="Courier New"/>
+        </w:rPr>
+      </w:pPr>
+      <w:r>
+        <w:rPr>
+          <w:rFonts w:ascii="Courier New" w:hAnsi="Courier New"/>
+        </w:rPr>
+      </w:r>
+    </w:p>
+    <w:p>
+      <w:pPr>
+        <w:pStyle w:val="Code"/>
+        <w:rPr>
+          <w:rFonts w:ascii="Courier New" w:hAnsi="Courier New"/>
+        </w:rPr>
+      </w:pPr>
+      <w:r>
+        <w:rPr>
+          <w:rFonts w:ascii="Courier New" w:hAnsi="Courier New"/>
+        </w:rPr>
+        <w:t xml:space="preserve">    </w:t>
+      </w:r>
+      <w:r>
+        <w:rPr>
+          <w:rFonts w:ascii="Courier New" w:hAnsi="Courier New"/>
+          <w:sz w:val="21"/>
+        </w:rPr>
+        <w:t>setResult(powerModular(base, exponent, modulus));</w:t>
+      </w:r>
+    </w:p>
+    <w:p>
+      <w:pPr>
+        <w:pStyle w:val="Code"/>
+        <w:rPr>
+          <w:rFonts w:ascii="Courier New" w:hAnsi="Courier New"/>
+        </w:rPr>
+      </w:pPr>
+      <w:r>
+        <w:rPr>
+          <w:rFonts w:ascii="Courier New" w:hAnsi="Courier New"/>
+        </w:rPr>
+        <w:t xml:space="preserve">  </w:t>
+      </w:r>
+      <w:r>
+        <w:rPr>
+          <w:rFonts w:ascii="Courier New" w:hAnsi="Courier New"/>
+          <w:sz w:val="21"/>
+        </w:rPr>
+        <w:t>};</w:t>
+      </w:r>
+    </w:p>
+    <w:p>
+      <w:pPr>
+        <w:pStyle w:val="Code"/>
+        <w:rPr>
+          <w:rFonts w:ascii="Courier New" w:hAnsi="Courier New"/>
+        </w:rPr>
+      </w:pPr>
+      <w:r>
+        <w:rPr>
+          <w:rFonts w:ascii="Courier New" w:hAnsi="Courier New"/>
+        </w:rPr>
+      </w:r>
+    </w:p>
+    <w:p>
+      <w:pPr>
+        <w:pStyle w:val="Code"/>
+        <w:rPr>
+          <w:rFonts w:ascii="Courier New" w:hAnsi="Courier New"/>
+        </w:rPr>
+      </w:pPr>
+      <w:r>
+        <w:rPr>
+          <w:rFonts w:ascii="Courier New" w:hAnsi="Courier New"/>
+        </w:rPr>
+        <w:t xml:space="preserve">  </w:t>
+      </w:r>
+      <w:r>
+        <w:rPr>
+          <w:rFonts w:ascii="Courier New" w:hAnsi="Courier New"/>
+          <w:sz w:val="21"/>
+        </w:rPr>
+        <w:t>return (</w:t>
+      </w:r>
+    </w:p>
+    <w:p>
+      <w:pPr>
+        <w:pStyle w:val="Code"/>
+        <w:rPr>
+          <w:rFonts w:ascii="Courier New" w:hAnsi="Courier New"/>
+        </w:rPr>
+      </w:pPr>
+      <w:r>
+        <w:rPr>
+          <w:rFonts w:ascii="Courier New" w:hAnsi="Courier New"/>
+        </w:rPr>
+        <w:t xml:space="preserve">    </w:t>
+      </w:r>
+      <w:r>
+        <w:rPr>
+          <w:rFonts w:ascii="Courier New" w:hAnsi="Courier New"/>
+          <w:sz w:val="21"/>
+        </w:rPr>
+        <w:t>&lt;div className="min-h-screen bg-linear-to-br to-sky-50 p-3 flex flex-col gap-3 items-center justify-center"&gt;</w:t>
+      </w:r>
+    </w:p>
+    <w:p>
+      <w:pPr>
+        <w:pStyle w:val="Code"/>
+        <w:rPr>
+          <w:rFonts w:ascii="Courier New" w:hAnsi="Courier New"/>
+        </w:rPr>
+      </w:pPr>
+      <w:r>
+        <w:rPr>
+          <w:rFonts w:ascii="Courier New" w:hAnsi="Courier New"/>
+        </w:rPr>
+        <w:t xml:space="preserve">      </w:t>
+      </w:r>
+      <w:r>
+        <w:rPr>
+          <w:rFonts w:ascii="Courier New" w:hAnsi="Courier New"/>
+          <w:sz w:val="21"/>
+        </w:rPr>
+        <w:t>&lt;section className="bg-white rounded-md p-3 flex flex-col w-64"&gt;</w:t>
+      </w:r>
+    </w:p>
+    <w:p>
+      <w:pPr>
+        <w:pStyle w:val="Code"/>
+        <w:rPr>
+          <w:rFonts w:ascii="Courier New" w:hAnsi="Courier New"/>
+        </w:rPr>
+      </w:pPr>
+      <w:r>
+        <w:rPr>
+          <w:rFonts w:ascii="Courier New" w:hAnsi="Courier New"/>
+        </w:rPr>
+        <w:t xml:space="preserve">        </w:t>
+      </w:r>
+      <w:r>
+        <w:rPr>
+          <w:rFonts w:ascii="Courier New" w:hAnsi="Courier New"/>
+          <w:sz w:val="21"/>
+        </w:rPr>
+        <w:t>&lt;h1 className="font-bold"&gt;TR2. Binary Exponent&lt;/h1&gt;</w:t>
+      </w:r>
+    </w:p>
+    <w:p>
+      <w:pPr>
+        <w:pStyle w:val="Code"/>
+        <w:rPr>
+          <w:rFonts w:ascii="Courier New" w:hAnsi="Courier New"/>
+        </w:rPr>
+      </w:pPr>
+      <w:r>
+        <w:rPr>
+          <w:rFonts w:ascii="Courier New" w:hAnsi="Courier New"/>
+        </w:rPr>
+        <w:t xml:space="preserve">      </w:t>
+      </w:r>
+      <w:r>
+        <w:rPr>
+          <w:rFonts w:ascii="Courier New" w:hAnsi="Courier New"/>
+          <w:sz w:val="21"/>
+        </w:rPr>
+        <w:t>&lt;/section&gt;</w:t>
+      </w:r>
+    </w:p>
+    <w:p>
+      <w:pPr>
+        <w:pStyle w:val="Code"/>
+        <w:rPr>
+          <w:rFonts w:ascii="Courier New" w:hAnsi="Courier New"/>
+        </w:rPr>
+      </w:pPr>
+      <w:r>
+        <w:rPr>
+          <w:rFonts w:ascii="Courier New" w:hAnsi="Courier New"/>
+        </w:rPr>
+        <w:t xml:space="preserve">      </w:t>
+      </w:r>
+      <w:r>
+        <w:rPr>
+          <w:rFonts w:ascii="Courier New" w:hAnsi="Courier New"/>
+          <w:sz w:val="21"/>
+        </w:rPr>
+        <w:t>&lt;section className="bg-white rounded-md p-3 flex flex-col w-64"&gt;</w:t>
+      </w:r>
+    </w:p>
+    <w:p>
+      <w:pPr>
+        <w:pStyle w:val="Code"/>
+        <w:rPr>
+          <w:rFonts w:ascii="Courier New" w:hAnsi="Courier New"/>
+        </w:rPr>
+      </w:pPr>
+      <w:r>
+        <w:rPr>
+          <w:rFonts w:ascii="Courier New" w:hAnsi="Courier New"/>
+        </w:rPr>
+        <w:t xml:space="preserve">        </w:t>
+      </w:r>
+      <w:r>
+        <w:rPr>
+          <w:rFonts w:ascii="Courier New" w:hAnsi="Courier New"/>
+          <w:sz w:val="21"/>
+        </w:rPr>
+        <w:t>&lt;form className="flex flex-col gap-3" onSubmit={handleSubmit}&gt;</w:t>
+      </w:r>
+    </w:p>
+    <w:p>
+      <w:pPr>
+        <w:pStyle w:val="Code"/>
+        <w:rPr>
+          <w:rFonts w:ascii="Courier New" w:hAnsi="Courier New"/>
+        </w:rPr>
+      </w:pPr>
+      <w:r>
+        <w:rPr>
+          <w:rFonts w:ascii="Courier New" w:hAnsi="Courier New"/>
+        </w:rPr>
+        <w:t xml:space="preserve">          </w:t>
+      </w:r>
+      <w:r>
+        <w:rPr>
+          <w:rFonts w:ascii="Courier New" w:hAnsi="Courier New"/>
+          <w:sz w:val="21"/>
+        </w:rPr>
+        <w:t>&lt;div className="flex flex-col gap-1"&gt;</w:t>
+      </w:r>
+    </w:p>
+    <w:p>
+      <w:pPr>
+        <w:pStyle w:val="Code"/>
+        <w:rPr>
+          <w:rFonts w:ascii="Courier New" w:hAnsi="Courier New"/>
+        </w:rPr>
+      </w:pPr>
+      <w:r>
+        <w:rPr>
+          <w:rFonts w:ascii="Courier New" w:hAnsi="Courier New"/>
+        </w:rPr>
+        <w:t xml:space="preserve">            </w:t>
+      </w:r>
+      <w:r>
+        <w:rPr>
+          <w:rFonts w:ascii="Courier New" w:hAnsi="Courier New"/>
+          <w:sz w:val="21"/>
+        </w:rPr>
+        <w:t>&lt;label htmlFor="baseInput" className="label"&gt;</w:t>
+      </w:r>
+    </w:p>
+    <w:p>
+      <w:pPr>
+        <w:pStyle w:val="Code"/>
+        <w:rPr>
+          <w:rFonts w:ascii="Courier New" w:hAnsi="Courier New"/>
+        </w:rPr>
+      </w:pPr>
+      <w:r>
+        <w:rPr>
+          <w:rFonts w:ascii="Courier New" w:hAnsi="Courier New"/>
+        </w:rPr>
+        <w:t xml:space="preserve">              </w:t>
+      </w:r>
+      <w:r>
+        <w:rPr>
+          <w:rFonts w:ascii="Courier New" w:hAnsi="Courier New"/>
+          <w:sz w:val="21"/>
+        </w:rPr>
+        <w:t>Base</w:t>
+      </w:r>
+    </w:p>
+    <w:p>
+      <w:pPr>
+        <w:pStyle w:val="Code"/>
+        <w:rPr>
+          <w:rFonts w:ascii="Courier New" w:hAnsi="Courier New"/>
+        </w:rPr>
+      </w:pPr>
+      <w:r>
+        <w:rPr>
+          <w:rFonts w:ascii="Courier New" w:hAnsi="Courier New"/>
+        </w:rPr>
+        <w:t xml:space="preserve">            </w:t>
+      </w:r>
+      <w:r>
+        <w:rPr>
+          <w:rFonts w:ascii="Courier New" w:hAnsi="Courier New"/>
+          <w:sz w:val="21"/>
+        </w:rPr>
+        <w:t>&lt;/label&gt;</w:t>
+      </w:r>
+    </w:p>
+    <w:p>
+      <w:pPr>
+        <w:pStyle w:val="Code"/>
+        <w:rPr>
+          <w:rFonts w:ascii="Courier New" w:hAnsi="Courier New"/>
+        </w:rPr>
+      </w:pPr>
+      <w:r>
+        <w:rPr>
+          <w:rFonts w:ascii="Courier New" w:hAnsi="Courier New"/>
+        </w:rPr>
+        <w:t xml:space="preserve">            </w:t>
+      </w:r>
+      <w:r>
+        <w:rPr>
+          <w:rFonts w:ascii="Courier New" w:hAnsi="Courier New"/>
+          <w:sz w:val="21"/>
+        </w:rPr>
+        <w:t>&lt;input</w:t>
+      </w:r>
+    </w:p>
+    <w:p>
+      <w:pPr>
+        <w:pStyle w:val="Code"/>
+        <w:rPr>
+          <w:rFonts w:ascii="Courier New" w:hAnsi="Courier New"/>
+        </w:rPr>
+      </w:pPr>
+      <w:r>
+        <w:rPr>
+          <w:rFonts w:ascii="Courier New" w:hAnsi="Courier New"/>
+        </w:rPr>
+        <w:t xml:space="preserve">              </w:t>
+      </w:r>
+      <w:r>
+        <w:rPr>
+          <w:rFonts w:ascii="Courier New" w:hAnsi="Courier New"/>
+          <w:sz w:val="21"/>
+        </w:rPr>
+        <w:t>id="baseInput"</w:t>
+      </w:r>
+    </w:p>
+    <w:p>
+      <w:pPr>
+        <w:pStyle w:val="Code"/>
+        <w:rPr>
+          <w:rFonts w:ascii="Courier New" w:hAnsi="Courier New"/>
+        </w:rPr>
+      </w:pPr>
+      <w:r>
+        <w:rPr>
+          <w:rFonts w:ascii="Courier New" w:hAnsi="Courier New"/>
+        </w:rPr>
+        <w:t xml:space="preserve">              </w:t>
+      </w:r>
+      <w:r>
+        <w:rPr>
+          <w:rFonts w:ascii="Courier New" w:hAnsi="Courier New"/>
+          <w:sz w:val="21"/>
+        </w:rPr>
+        <w:t>className="input"</w:t>
+      </w:r>
+    </w:p>
+    <w:p>
+      <w:pPr>
+        <w:pStyle w:val="Code"/>
+        <w:rPr>
+          <w:rFonts w:ascii="Courier New" w:hAnsi="Courier New"/>
+        </w:rPr>
+      </w:pPr>
+      <w:r>
+        <w:rPr>
+          <w:rFonts w:ascii="Courier New" w:hAnsi="Courier New"/>
+        </w:rPr>
+        <w:t xml:space="preserve">              </w:t>
+      </w:r>
+      <w:r>
+        <w:rPr>
+          <w:rFonts w:ascii="Courier New" w:hAnsi="Courier New"/>
+          <w:sz w:val="21"/>
+        </w:rPr>
+        <w:t>type="text"</w:t>
+      </w:r>
+    </w:p>
+    <w:p>
+      <w:pPr>
+        <w:pStyle w:val="Code"/>
+        <w:rPr>
+          <w:rFonts w:ascii="Courier New" w:hAnsi="Courier New"/>
+        </w:rPr>
+      </w:pPr>
+      <w:r>
+        <w:rPr>
+          <w:rFonts w:ascii="Courier New" w:hAnsi="Courier New"/>
+        </w:rPr>
+        <w:t xml:space="preserve">              </w:t>
+      </w:r>
+      <w:r>
+        <w:rPr>
+          <w:rFonts w:ascii="Courier New" w:hAnsi="Courier New"/>
+          <w:sz w:val="21"/>
+        </w:rPr>
+        <w:t>value={base}</w:t>
+      </w:r>
+    </w:p>
+    <w:p>
+      <w:pPr>
+        <w:pStyle w:val="Code"/>
+        <w:rPr>
+          <w:rFonts w:ascii="Courier New" w:hAnsi="Courier New"/>
+        </w:rPr>
+      </w:pPr>
+      <w:r>
+        <w:rPr>
+          <w:rFonts w:ascii="Courier New" w:hAnsi="Courier New"/>
+        </w:rPr>
+        <w:t xml:space="preserve">              </w:t>
+      </w:r>
+      <w:r>
+        <w:rPr>
+          <w:rFonts w:ascii="Courier New" w:hAnsi="Courier New"/>
+          <w:sz w:val="21"/>
+        </w:rPr>
+        <w:t>onChange={(e) =&gt; setBase(+e.target.value)}</w:t>
+      </w:r>
+    </w:p>
+    <w:p>
+      <w:pPr>
+        <w:pStyle w:val="Code"/>
+        <w:rPr>
+          <w:rFonts w:ascii="Courier New" w:hAnsi="Courier New"/>
+        </w:rPr>
+      </w:pPr>
+      <w:r>
+        <w:rPr>
+          <w:rFonts w:ascii="Courier New" w:hAnsi="Courier New"/>
+        </w:rPr>
+        <w:t xml:space="preserve">            </w:t>
+      </w:r>
+      <w:r>
+        <w:rPr>
+          <w:rFonts w:ascii="Courier New" w:hAnsi="Courier New"/>
+          <w:sz w:val="21"/>
+        </w:rPr>
+        <w:t>/&gt;</w:t>
+      </w:r>
+    </w:p>
+    <w:p>
+      <w:pPr>
+        <w:pStyle w:val="Code"/>
+        <w:rPr>
+          <w:rFonts w:ascii="Courier New" w:hAnsi="Courier New"/>
+        </w:rPr>
+      </w:pPr>
+      <w:r>
+        <w:rPr>
+          <w:rFonts w:ascii="Courier New" w:hAnsi="Courier New"/>
+        </w:rPr>
+        <w:t xml:space="preserve">          </w:t>
+      </w:r>
+      <w:r>
+        <w:rPr>
+          <w:rFonts w:ascii="Courier New" w:hAnsi="Courier New"/>
+          <w:sz w:val="21"/>
+        </w:rPr>
+        <w:t>&lt;/div&gt;</w:t>
+      </w:r>
+    </w:p>
+    <w:p>
+      <w:pPr>
+        <w:pStyle w:val="Code"/>
+        <w:rPr>
+          <w:rFonts w:ascii="Courier New" w:hAnsi="Courier New"/>
+        </w:rPr>
+      </w:pPr>
+      <w:r>
+        <w:rPr>
+          <w:rFonts w:ascii="Courier New" w:hAnsi="Courier New"/>
+        </w:rPr>
+      </w:r>
+    </w:p>
+    <w:p>
+      <w:pPr>
+        <w:pStyle w:val="Code"/>
+        <w:rPr>
+          <w:rFonts w:ascii="Courier New" w:hAnsi="Courier New"/>
+        </w:rPr>
+      </w:pPr>
+      <w:r>
+        <w:rPr>
+          <w:rFonts w:ascii="Courier New" w:hAnsi="Courier New"/>
+        </w:rPr>
+        <w:t xml:space="preserve">          </w:t>
+      </w:r>
+      <w:r>
+        <w:rPr>
+          <w:rFonts w:ascii="Courier New" w:hAnsi="Courier New"/>
+          <w:sz w:val="21"/>
+        </w:rPr>
+        <w:t>&lt;div className="flex flex-col gap-1"&gt;</w:t>
+      </w:r>
+    </w:p>
+    <w:p>
+      <w:pPr>
+        <w:pStyle w:val="Code"/>
+        <w:rPr>
+          <w:rFonts w:ascii="Courier New" w:hAnsi="Courier New"/>
+        </w:rPr>
+      </w:pPr>
+      <w:r>
+        <w:rPr>
+          <w:rFonts w:ascii="Courier New" w:hAnsi="Courier New"/>
+        </w:rPr>
+        <w:t xml:space="preserve">            </w:t>
+      </w:r>
+      <w:r>
+        <w:rPr>
+          <w:rFonts w:ascii="Courier New" w:hAnsi="Courier New"/>
+          <w:sz w:val="21"/>
+        </w:rPr>
+        <w:t>&lt;label htmlFor="exponentInput" className="label"&gt;</w:t>
+      </w:r>
+    </w:p>
+    <w:p>
+      <w:pPr>
+        <w:pStyle w:val="Code"/>
+        <w:rPr>
+          <w:rFonts w:ascii="Courier New" w:hAnsi="Courier New"/>
+        </w:rPr>
+      </w:pPr>
+      <w:r>
+        <w:rPr>
+          <w:rFonts w:ascii="Courier New" w:hAnsi="Courier New"/>
+        </w:rPr>
+        <w:t xml:space="preserve">              </w:t>
+      </w:r>
+      <w:r>
+        <w:rPr>
+          <w:rFonts w:ascii="Courier New" w:hAnsi="Courier New"/>
+          <w:sz w:val="21"/>
+        </w:rPr>
+        <w:t>Exponent</w:t>
+      </w:r>
+    </w:p>
+    <w:p>
+      <w:pPr>
+        <w:pStyle w:val="Code"/>
+        <w:rPr>
+          <w:rFonts w:ascii="Courier New" w:hAnsi="Courier New"/>
+        </w:rPr>
+      </w:pPr>
+      <w:r>
+        <w:rPr>
+          <w:rFonts w:ascii="Courier New" w:hAnsi="Courier New"/>
+        </w:rPr>
+        <w:t xml:space="preserve">            </w:t>
+      </w:r>
+      <w:r>
+        <w:rPr>
+          <w:rFonts w:ascii="Courier New" w:hAnsi="Courier New"/>
+          <w:sz w:val="21"/>
+        </w:rPr>
+        <w:t>&lt;/label&gt;</w:t>
+      </w:r>
+    </w:p>
+    <w:p>
+      <w:pPr>
+        <w:pStyle w:val="Code"/>
+        <w:rPr>
+          <w:rFonts w:ascii="Courier New" w:hAnsi="Courier New"/>
+        </w:rPr>
+      </w:pPr>
+      <w:r>
+        <w:rPr>
+          <w:rFonts w:ascii="Courier New" w:hAnsi="Courier New"/>
+        </w:rPr>
+        <w:t xml:space="preserve">            </w:t>
+      </w:r>
+      <w:r>
+        <w:rPr>
+          <w:rFonts w:ascii="Courier New" w:hAnsi="Courier New"/>
+          <w:sz w:val="21"/>
+        </w:rPr>
+        <w:t>&lt;input</w:t>
+      </w:r>
+    </w:p>
+    <w:p>
+      <w:pPr>
+        <w:pStyle w:val="Code"/>
+        <w:rPr>
+          <w:rFonts w:ascii="Courier New" w:hAnsi="Courier New"/>
+        </w:rPr>
+      </w:pPr>
+      <w:r>
+        <w:rPr>
+          <w:rFonts w:ascii="Courier New" w:hAnsi="Courier New"/>
+        </w:rPr>
+        <w:t xml:space="preserve">              </w:t>
+      </w:r>
+      <w:r>
+        <w:rPr>
+          <w:rFonts w:ascii="Courier New" w:hAnsi="Courier New"/>
+          <w:sz w:val="21"/>
+        </w:rPr>
+        <w:t>id="exponentInput"</w:t>
+      </w:r>
+    </w:p>
+    <w:p>
+      <w:pPr>
+        <w:pStyle w:val="Code"/>
+        <w:rPr>
+          <w:rFonts w:ascii="Courier New" w:hAnsi="Courier New"/>
+        </w:rPr>
+      </w:pPr>
+      <w:r>
+        <w:rPr>
+          <w:rFonts w:ascii="Courier New" w:hAnsi="Courier New"/>
+        </w:rPr>
+        <w:t xml:space="preserve">              </w:t>
+      </w:r>
+      <w:r>
+        <w:rPr>
+          <w:rFonts w:ascii="Courier New" w:hAnsi="Courier New"/>
+          <w:sz w:val="21"/>
+        </w:rPr>
+        <w:t>className="input"</w:t>
+      </w:r>
+    </w:p>
+    <w:p>
+      <w:pPr>
+        <w:pStyle w:val="Code"/>
+        <w:rPr>
+          <w:rFonts w:ascii="Courier New" w:hAnsi="Courier New"/>
+        </w:rPr>
+      </w:pPr>
+      <w:r>
+        <w:rPr>
+          <w:rFonts w:ascii="Courier New" w:hAnsi="Courier New"/>
+        </w:rPr>
+        <w:t xml:space="preserve">              </w:t>
+      </w:r>
+      <w:r>
+        <w:rPr>
+          <w:rFonts w:ascii="Courier New" w:hAnsi="Courier New"/>
+          <w:sz w:val="21"/>
+        </w:rPr>
+        <w:t>type="text"</w:t>
+      </w:r>
+    </w:p>
+    <w:p>
+      <w:pPr>
+        <w:pStyle w:val="Code"/>
+        <w:rPr>
+          <w:rFonts w:ascii="Courier New" w:hAnsi="Courier New"/>
+        </w:rPr>
+      </w:pPr>
+      <w:r>
+        <w:rPr>
+          <w:rFonts w:ascii="Courier New" w:hAnsi="Courier New"/>
+        </w:rPr>
+        <w:t xml:space="preserve">              </w:t>
+      </w:r>
+      <w:r>
+        <w:rPr>
+          <w:rFonts w:ascii="Courier New" w:hAnsi="Courier New"/>
+          <w:sz w:val="21"/>
+        </w:rPr>
+        <w:t>value={exponent}</w:t>
+      </w:r>
+    </w:p>
+    <w:p>
+      <w:pPr>
+        <w:pStyle w:val="Code"/>
+        <w:rPr>
+          <w:rFonts w:ascii="Courier New" w:hAnsi="Courier New"/>
+        </w:rPr>
+      </w:pPr>
+      <w:r>
+        <w:rPr>
+          <w:rFonts w:ascii="Courier New" w:hAnsi="Courier New"/>
+        </w:rPr>
+        <w:t xml:space="preserve">              </w:t>
+      </w:r>
+      <w:r>
+        <w:rPr>
+          <w:rFonts w:ascii="Courier New" w:hAnsi="Courier New"/>
+          <w:sz w:val="21"/>
+        </w:rPr>
+        <w:t>onChange={(e) =&gt; setExponent(+e.target.value)}</w:t>
+      </w:r>
+    </w:p>
+    <w:p>
+      <w:pPr>
+        <w:pStyle w:val="Code"/>
+        <w:rPr>
+          <w:rFonts w:ascii="Courier New" w:hAnsi="Courier New"/>
+        </w:rPr>
+      </w:pPr>
+      <w:r>
+        <w:rPr>
+          <w:rFonts w:ascii="Courier New" w:hAnsi="Courier New"/>
+        </w:rPr>
+        <w:t xml:space="preserve">            </w:t>
+      </w:r>
+      <w:r>
+        <w:rPr>
+          <w:rFonts w:ascii="Courier New" w:hAnsi="Courier New"/>
+          <w:sz w:val="21"/>
+        </w:rPr>
+        <w:t>/&gt;</w:t>
+      </w:r>
+    </w:p>
+    <w:p>
+      <w:pPr>
+        <w:pStyle w:val="Code"/>
+        <w:rPr>
+          <w:rFonts w:ascii="Courier New" w:hAnsi="Courier New"/>
+        </w:rPr>
+      </w:pPr>
+      <w:r>
+        <w:rPr>
+          <w:rFonts w:ascii="Courier New" w:hAnsi="Courier New"/>
+        </w:rPr>
+        <w:t xml:space="preserve">          </w:t>
+      </w:r>
+      <w:r>
+        <w:rPr>
+          <w:rFonts w:ascii="Courier New" w:hAnsi="Courier New"/>
+          <w:sz w:val="21"/>
+        </w:rPr>
+        <w:t>&lt;/div&gt;</w:t>
+      </w:r>
+    </w:p>
+    <w:p>
+      <w:pPr>
+        <w:pStyle w:val="Code"/>
+        <w:rPr>
+          <w:rFonts w:ascii="Courier New" w:hAnsi="Courier New"/>
+        </w:rPr>
+      </w:pPr>
+      <w:r>
+        <w:rPr>
+          <w:rFonts w:ascii="Courier New" w:hAnsi="Courier New"/>
+        </w:rPr>
+      </w:r>
+    </w:p>
+    <w:p>
+      <w:pPr>
+        <w:pStyle w:val="Code"/>
+        <w:rPr>
+          <w:rFonts w:ascii="Courier New" w:hAnsi="Courier New"/>
+        </w:rPr>
+      </w:pPr>
+      <w:r>
+        <w:rPr>
+          <w:rFonts w:ascii="Courier New" w:hAnsi="Courier New"/>
+        </w:rPr>
+        <w:t xml:space="preserve">          </w:t>
+      </w:r>
+      <w:r>
+        <w:rPr>
+          <w:rFonts w:ascii="Courier New" w:hAnsi="Courier New"/>
+          <w:sz w:val="21"/>
+        </w:rPr>
+        <w:t>&lt;div className="flex flex-col gap-1"&gt;</w:t>
+      </w:r>
+    </w:p>
+    <w:p>
+      <w:pPr>
+        <w:pStyle w:val="Code"/>
+        <w:rPr>
+          <w:rFonts w:ascii="Courier New" w:hAnsi="Courier New"/>
+        </w:rPr>
+      </w:pPr>
+      <w:r>
+        <w:rPr>
+          <w:rFonts w:ascii="Courier New" w:hAnsi="Courier New"/>
+        </w:rPr>
+        <w:t xml:space="preserve">            </w:t>
+      </w:r>
+      <w:r>
+        <w:rPr>
+          <w:rFonts w:ascii="Courier New" w:hAnsi="Courier New"/>
+          <w:sz w:val="21"/>
+        </w:rPr>
+        <w:t>&lt;label htmlFor="modulusInput" className="label"&gt;</w:t>
+      </w:r>
+    </w:p>
+    <w:p>
+      <w:pPr>
+        <w:pStyle w:val="Code"/>
+        <w:rPr>
+          <w:rFonts w:ascii="Courier New" w:hAnsi="Courier New"/>
+        </w:rPr>
+      </w:pPr>
+      <w:r>
+        <w:rPr>
+          <w:rFonts w:ascii="Courier New" w:hAnsi="Courier New"/>
+        </w:rPr>
+        <w:t xml:space="preserve">              </w:t>
+      </w:r>
+      <w:r>
+        <w:rPr>
+          <w:rFonts w:ascii="Courier New" w:hAnsi="Courier New"/>
+          <w:sz w:val="21"/>
+        </w:rPr>
+        <w:t>Modulus</w:t>
+      </w:r>
+    </w:p>
+    <w:p>
+      <w:pPr>
+        <w:pStyle w:val="Code"/>
+        <w:rPr>
+          <w:rFonts w:ascii="Courier New" w:hAnsi="Courier New"/>
+        </w:rPr>
+      </w:pPr>
+      <w:r>
+        <w:rPr>
+          <w:rFonts w:ascii="Courier New" w:hAnsi="Courier New"/>
+        </w:rPr>
+        <w:t xml:space="preserve">            </w:t>
+      </w:r>
+      <w:r>
+        <w:rPr>
+          <w:rFonts w:ascii="Courier New" w:hAnsi="Courier New"/>
+          <w:sz w:val="21"/>
+        </w:rPr>
+        <w:t>&lt;/label&gt;</w:t>
+      </w:r>
+    </w:p>
+    <w:p>
+      <w:pPr>
+        <w:pStyle w:val="Code"/>
+        <w:rPr>
+          <w:rFonts w:ascii="Courier New" w:hAnsi="Courier New"/>
+        </w:rPr>
+      </w:pPr>
+      <w:r>
+        <w:rPr>
+          <w:rFonts w:ascii="Courier New" w:hAnsi="Courier New"/>
+        </w:rPr>
+        <w:t xml:space="preserve">            </w:t>
+      </w:r>
+      <w:r>
+        <w:rPr>
+          <w:rFonts w:ascii="Courier New" w:hAnsi="Courier New"/>
+          <w:sz w:val="21"/>
+        </w:rPr>
+        <w:t>&lt;input</w:t>
+      </w:r>
+    </w:p>
+    <w:p>
+      <w:pPr>
+        <w:pStyle w:val="Code"/>
+        <w:rPr>
+          <w:rFonts w:ascii="Courier New" w:hAnsi="Courier New"/>
+        </w:rPr>
+      </w:pPr>
+      <w:r>
+        <w:rPr>
+          <w:rFonts w:ascii="Courier New" w:hAnsi="Courier New"/>
+        </w:rPr>
+        <w:t xml:space="preserve">              </w:t>
+      </w:r>
+      <w:r>
+        <w:rPr>
+          <w:rFonts w:ascii="Courier New" w:hAnsi="Courier New"/>
+          <w:sz w:val="21"/>
+        </w:rPr>
+        <w:t>id="modulusInput"</w:t>
+      </w:r>
+    </w:p>
+    <w:p>
+      <w:pPr>
+        <w:pStyle w:val="Code"/>
+        <w:rPr>
+          <w:rFonts w:ascii="Courier New" w:hAnsi="Courier New"/>
+        </w:rPr>
+      </w:pPr>
+      <w:r>
+        <w:rPr>
+          <w:rFonts w:ascii="Courier New" w:hAnsi="Courier New"/>
+        </w:rPr>
+        <w:t xml:space="preserve">              </w:t>
+      </w:r>
+      <w:r>
+        <w:rPr>
+          <w:rFonts w:ascii="Courier New" w:hAnsi="Courier New"/>
+          <w:sz w:val="21"/>
+        </w:rPr>
+        <w:t>className="input"</w:t>
+      </w:r>
+    </w:p>
+    <w:p>
+      <w:pPr>
+        <w:pStyle w:val="Code"/>
+        <w:rPr>
+          <w:rFonts w:ascii="Courier New" w:hAnsi="Courier New"/>
+        </w:rPr>
+      </w:pPr>
+      <w:r>
+        <w:rPr>
+          <w:rFonts w:ascii="Courier New" w:hAnsi="Courier New"/>
+        </w:rPr>
+        <w:t xml:space="preserve">              </w:t>
+      </w:r>
+      <w:r>
+        <w:rPr>
+          <w:rFonts w:ascii="Courier New" w:hAnsi="Courier New"/>
+          <w:sz w:val="21"/>
+        </w:rPr>
+        <w:t>type="text"</w:t>
+      </w:r>
+    </w:p>
+    <w:p>
+      <w:pPr>
+        <w:pStyle w:val="Code"/>
+        <w:rPr>
+          <w:rFonts w:ascii="Courier New" w:hAnsi="Courier New"/>
+        </w:rPr>
+      </w:pPr>
+      <w:r>
+        <w:rPr>
+          <w:rFonts w:ascii="Courier New" w:hAnsi="Courier New"/>
+        </w:rPr>
+        <w:t xml:space="preserve">              </w:t>
+      </w:r>
+      <w:r>
+        <w:rPr>
+          <w:rFonts w:ascii="Courier New" w:hAnsi="Courier New"/>
+          <w:sz w:val="21"/>
+        </w:rPr>
+        <w:t>value={modulus}</w:t>
+      </w:r>
+    </w:p>
+    <w:p>
+      <w:pPr>
+        <w:pStyle w:val="Code"/>
+        <w:rPr>
+          <w:rFonts w:ascii="Courier New" w:hAnsi="Courier New"/>
+        </w:rPr>
+      </w:pPr>
+      <w:r>
+        <w:rPr>
+          <w:rFonts w:ascii="Courier New" w:hAnsi="Courier New"/>
+        </w:rPr>
+        <w:t xml:space="preserve">              </w:t>
+      </w:r>
+      <w:r>
+        <w:rPr>
+          <w:rFonts w:ascii="Courier New" w:hAnsi="Courier New"/>
+          <w:sz w:val="21"/>
+        </w:rPr>
+        <w:t>onChange={(e) =&gt; setModulus(+e.target.value)}</w:t>
+      </w:r>
+    </w:p>
+    <w:p>
+      <w:pPr>
+        <w:pStyle w:val="Code"/>
+        <w:rPr>
+          <w:rFonts w:ascii="Courier New" w:hAnsi="Courier New"/>
+        </w:rPr>
+      </w:pPr>
+      <w:r>
+        <w:rPr>
+          <w:rFonts w:ascii="Courier New" w:hAnsi="Courier New"/>
+        </w:rPr>
+        <w:t xml:space="preserve">            </w:t>
+      </w:r>
+      <w:r>
+        <w:rPr>
+          <w:rFonts w:ascii="Courier New" w:hAnsi="Courier New"/>
+          <w:sz w:val="21"/>
+        </w:rPr>
+        <w:t>/&gt;</w:t>
+      </w:r>
+    </w:p>
+    <w:p>
+      <w:pPr>
+        <w:pStyle w:val="Code"/>
+        <w:rPr>
+          <w:rFonts w:ascii="Courier New" w:hAnsi="Courier New"/>
+        </w:rPr>
+      </w:pPr>
+      <w:r>
+        <w:rPr>
+          <w:rFonts w:ascii="Courier New" w:hAnsi="Courier New"/>
+        </w:rPr>
+        <w:t xml:space="preserve">          </w:t>
+      </w:r>
+      <w:r>
+        <w:rPr>
+          <w:rFonts w:ascii="Courier New" w:hAnsi="Courier New"/>
+          <w:sz w:val="21"/>
+        </w:rPr>
+        <w:t>&lt;/div&gt;</w:t>
+      </w:r>
+    </w:p>
+    <w:p>
+      <w:pPr>
+        <w:pStyle w:val="Code"/>
+        <w:rPr>
+          <w:rFonts w:ascii="Courier New" w:hAnsi="Courier New"/>
+        </w:rPr>
+      </w:pPr>
+      <w:r>
+        <w:rPr>
+          <w:rFonts w:ascii="Courier New" w:hAnsi="Courier New"/>
+        </w:rPr>
+      </w:r>
+    </w:p>
+    <w:p>
+      <w:pPr>
+        <w:pStyle w:val="Code"/>
+        <w:rPr>
+          <w:rFonts w:ascii="Courier New" w:hAnsi="Courier New"/>
+        </w:rPr>
+      </w:pPr>
+      <w:r>
+        <w:rPr>
+          <w:rFonts w:ascii="Courier New" w:hAnsi="Courier New"/>
+        </w:rPr>
+        <w:t xml:space="preserve">          </w:t>
+      </w:r>
+      <w:r>
+        <w:rPr>
+          <w:rFonts w:ascii="Courier New" w:hAnsi="Courier New"/>
+          <w:sz w:val="21"/>
+        </w:rPr>
+        <w:t>&lt;button className="btn"&gt;Submit&lt;/button&gt;</w:t>
+      </w:r>
+    </w:p>
+    <w:p>
+      <w:pPr>
+        <w:pStyle w:val="Code"/>
+        <w:rPr>
+          <w:rFonts w:ascii="Courier New" w:hAnsi="Courier New"/>
+        </w:rPr>
+      </w:pPr>
+      <w:r>
+        <w:rPr>
+          <w:rFonts w:ascii="Courier New" w:hAnsi="Courier New"/>
+        </w:rPr>
+        <w:t xml:space="preserve">        </w:t>
+      </w:r>
+      <w:r>
+        <w:rPr>
+          <w:rFonts w:ascii="Courier New" w:hAnsi="Courier New"/>
+          <w:sz w:val="21"/>
+        </w:rPr>
+        <w:t>&lt;/form&gt;</w:t>
+      </w:r>
+    </w:p>
+    <w:p>
+      <w:pPr>
+        <w:pStyle w:val="Code"/>
+        <w:rPr>
+          <w:rFonts w:ascii="Courier New" w:hAnsi="Courier New"/>
+        </w:rPr>
+      </w:pPr>
+      <w:r>
+        <w:rPr>
+          <w:rFonts w:ascii="Courier New" w:hAnsi="Courier New"/>
+        </w:rPr>
+        <w:t xml:space="preserve">      </w:t>
+      </w:r>
+      <w:r>
+        <w:rPr>
+          <w:rFonts w:ascii="Courier New" w:hAnsi="Courier New"/>
+          <w:sz w:val="21"/>
+        </w:rPr>
+        <w:t>&lt;/section&gt;</w:t>
+      </w:r>
+    </w:p>
+    <w:p>
+      <w:pPr>
+        <w:pStyle w:val="Code"/>
+        <w:rPr>
+          <w:rFonts w:ascii="Courier New" w:hAnsi="Courier New"/>
+        </w:rPr>
+      </w:pPr>
+      <w:r>
+        <w:rPr>
+          <w:rFonts w:ascii="Courier New" w:hAnsi="Courier New"/>
+        </w:rPr>
+      </w:r>
+    </w:p>
+    <w:p>
+      <w:pPr>
+        <w:pStyle w:val="Code"/>
+        <w:rPr>
+          <w:rFonts w:ascii="Courier New" w:hAnsi="Courier New"/>
+        </w:rPr>
+      </w:pPr>
+      <w:r>
+        <w:rPr>
+          <w:rFonts w:ascii="Courier New" w:hAnsi="Courier New"/>
+        </w:rPr>
+        <w:t xml:space="preserve">      </w:t>
+      </w:r>
+      <w:r>
+        <w:rPr>
+          <w:rFonts w:ascii="Courier New" w:hAnsi="Courier New"/>
+          <w:sz w:val="21"/>
+        </w:rPr>
+        <w:t>&lt;section className="bg-white rounded-md p-3 flex flex-col w-64"&gt;</w:t>
+      </w:r>
+    </w:p>
+    <w:p>
+      <w:pPr>
+        <w:pStyle w:val="Code"/>
+        <w:rPr>
+          <w:rFonts w:ascii="Courier New" w:hAnsi="Courier New"/>
+        </w:rPr>
+      </w:pPr>
+      <w:r>
+        <w:rPr>
+          <w:rFonts w:ascii="Courier New" w:hAnsi="Courier New"/>
+        </w:rPr>
+        <w:t xml:space="preserve">        </w:t>
+      </w:r>
+      <w:r>
+        <w:rPr>
+          <w:rFonts w:ascii="Courier New" w:hAnsi="Courier New"/>
+          <w:sz w:val="21"/>
+        </w:rPr>
+        <w:t>&lt;div className="flex flex-col gap-1"&gt;</w:t>
+      </w:r>
+    </w:p>
+    <w:p>
+      <w:pPr>
+        <w:pStyle w:val="Code"/>
+        <w:rPr>
+          <w:rFonts w:ascii="Courier New" w:hAnsi="Courier New"/>
+        </w:rPr>
+      </w:pPr>
+      <w:r>
+        <w:rPr>
+          <w:rFonts w:ascii="Courier New" w:hAnsi="Courier New"/>
+        </w:rPr>
+        <w:t xml:space="preserve">          </w:t>
+      </w:r>
+      <w:r>
+        <w:rPr>
+          <w:rFonts w:ascii="Courier New" w:hAnsi="Courier New"/>
+          <w:sz w:val="21"/>
+        </w:rPr>
+        <w:t>&lt;label htmlFor="output" className="label"&gt;</w:t>
+      </w:r>
+    </w:p>
+    <w:p>
+      <w:pPr>
+        <w:pStyle w:val="Code"/>
+        <w:rPr>
+          <w:rFonts w:ascii="Courier New" w:hAnsi="Courier New"/>
+        </w:rPr>
+      </w:pPr>
+      <w:r>
+        <w:rPr>
+          <w:rFonts w:ascii="Courier New" w:hAnsi="Courier New"/>
+        </w:rPr>
+        <w:t xml:space="preserve">            </w:t>
+      </w:r>
+      <w:r>
+        <w:rPr>
+          <w:rFonts w:ascii="Courier New" w:hAnsi="Courier New"/>
+          <w:sz w:val="21"/>
+        </w:rPr>
+        <w:t>Result</w:t>
+      </w:r>
+    </w:p>
+    <w:p>
+      <w:pPr>
+        <w:pStyle w:val="Code"/>
+        <w:rPr>
+          <w:rFonts w:ascii="Courier New" w:hAnsi="Courier New"/>
+        </w:rPr>
+      </w:pPr>
+      <w:r>
+        <w:rPr>
+          <w:rFonts w:ascii="Courier New" w:hAnsi="Courier New"/>
+        </w:rPr>
+        <w:t xml:space="preserve">          </w:t>
+      </w:r>
+      <w:r>
+        <w:rPr>
+          <w:rFonts w:ascii="Courier New" w:hAnsi="Courier New"/>
+          <w:sz w:val="21"/>
+        </w:rPr>
+        <w:t>&lt;/label&gt;</w:t>
+      </w:r>
+    </w:p>
+    <w:p>
+      <w:pPr>
+        <w:pStyle w:val="Code"/>
+        <w:rPr>
+          <w:rFonts w:ascii="Courier New" w:hAnsi="Courier New"/>
+        </w:rPr>
+      </w:pPr>
+      <w:r>
+        <w:rPr>
+          <w:rFonts w:ascii="Courier New" w:hAnsi="Courier New"/>
+        </w:rPr>
+        <w:t xml:space="preserve">          </w:t>
+      </w:r>
+      <w:r>
+        <w:rPr>
+          <w:rFonts w:ascii="Courier New" w:hAnsi="Courier New"/>
+          <w:sz w:val="21"/>
+        </w:rPr>
+        <w:t>&lt;textarea</w:t>
+      </w:r>
+    </w:p>
+    <w:p>
+      <w:pPr>
+        <w:pStyle w:val="Code"/>
+        <w:rPr>
+          <w:rFonts w:ascii="Courier New" w:hAnsi="Courier New"/>
+        </w:rPr>
+      </w:pPr>
+      <w:r>
+        <w:rPr>
+          <w:rFonts w:ascii="Courier New" w:hAnsi="Courier New"/>
+        </w:rPr>
+        <w:t xml:space="preserve">            </w:t>
+      </w:r>
+      <w:r>
+        <w:rPr>
+          <w:rFonts w:ascii="Courier New" w:hAnsi="Courier New"/>
+          <w:sz w:val="21"/>
+        </w:rPr>
+        <w:t>name="output"</w:t>
+      </w:r>
+    </w:p>
+    <w:p>
+      <w:pPr>
+        <w:pStyle w:val="Code"/>
+        <w:rPr>
+          <w:rFonts w:ascii="Courier New" w:hAnsi="Courier New"/>
+        </w:rPr>
+      </w:pPr>
+      <w:r>
+        <w:rPr>
+          <w:rFonts w:ascii="Courier New" w:hAnsi="Courier New"/>
+        </w:rPr>
+        <w:t xml:space="preserve">            </w:t>
+      </w:r>
+      <w:r>
+        <w:rPr>
+          <w:rFonts w:ascii="Courier New" w:hAnsi="Courier New"/>
+          <w:sz w:val="21"/>
+        </w:rPr>
+        <w:t>id="output"</w:t>
+      </w:r>
+    </w:p>
+    <w:p>
+      <w:pPr>
+        <w:pStyle w:val="Code"/>
+        <w:rPr>
+          <w:rFonts w:ascii="Courier New" w:hAnsi="Courier New"/>
+        </w:rPr>
+      </w:pPr>
+      <w:r>
+        <w:rPr>
+          <w:rFonts w:ascii="Courier New" w:hAnsi="Courier New"/>
+        </w:rPr>
+        <w:t xml:space="preserve">            </w:t>
+      </w:r>
+      <w:r>
+        <w:rPr>
+          <w:rFonts w:ascii="Courier New" w:hAnsi="Courier New"/>
+          <w:sz w:val="21"/>
+        </w:rPr>
+        <w:t>value={result}</w:t>
+      </w:r>
+    </w:p>
+    <w:p>
+      <w:pPr>
+        <w:pStyle w:val="Code"/>
+        <w:rPr>
+          <w:rFonts w:ascii="Courier New" w:hAnsi="Courier New"/>
+        </w:rPr>
+      </w:pPr>
+      <w:r>
+        <w:rPr>
+          <w:rFonts w:ascii="Courier New" w:hAnsi="Courier New"/>
+        </w:rPr>
+        <w:t xml:space="preserve">            </w:t>
+      </w:r>
+      <w:r>
+        <w:rPr>
+          <w:rFonts w:ascii="Courier New" w:hAnsi="Courier New"/>
+          <w:sz w:val="21"/>
+        </w:rPr>
+        <w:t>readOnly</w:t>
+      </w:r>
+    </w:p>
+    <w:p>
+      <w:pPr>
+        <w:pStyle w:val="Code"/>
+        <w:rPr>
+          <w:rFonts w:ascii="Courier New" w:hAnsi="Courier New"/>
+        </w:rPr>
+      </w:pPr>
+      <w:r>
+        <w:rPr>
+          <w:rFonts w:ascii="Courier New" w:hAnsi="Courier New"/>
+        </w:rPr>
+        <w:t xml:space="preserve">            </w:t>
+      </w:r>
+      <w:r>
+        <w:rPr>
+          <w:rFonts w:ascii="Courier New" w:hAnsi="Courier New"/>
+          <w:sz w:val="21"/>
+        </w:rPr>
+        <w:t>className="textarea resize-none"</w:t>
+      </w:r>
+    </w:p>
+    <w:p>
+      <w:pPr>
+        <w:pStyle w:val="Code"/>
+        <w:rPr>
+          <w:rFonts w:ascii="Courier New" w:hAnsi="Courier New"/>
+        </w:rPr>
+      </w:pPr>
+      <w:r>
+        <w:rPr>
+          <w:rFonts w:ascii="Courier New" w:hAnsi="Courier New"/>
+        </w:rPr>
+        <w:t xml:space="preserve">          </w:t>
+      </w:r>
+      <w:r>
+        <w:rPr>
+          <w:rFonts w:ascii="Courier New" w:hAnsi="Courier New"/>
+          <w:sz w:val="21"/>
+        </w:rPr>
+        <w:t>&gt;&lt;/textarea&gt;</w:t>
+      </w:r>
+    </w:p>
+    <w:p>
+      <w:pPr>
+        <w:pStyle w:val="Code"/>
+        <w:rPr>
+          <w:rFonts w:ascii="Courier New" w:hAnsi="Courier New"/>
+        </w:rPr>
+      </w:pPr>
+      <w:r>
+        <w:rPr>
+          <w:rFonts w:ascii="Courier New" w:hAnsi="Courier New"/>
+        </w:rPr>
+        <w:t xml:space="preserve">        </w:t>
+      </w:r>
+      <w:r>
+        <w:rPr>
+          <w:rFonts w:ascii="Courier New" w:hAnsi="Courier New"/>
+          <w:sz w:val="21"/>
+        </w:rPr>
+        <w:t>&lt;/div&gt;</w:t>
+      </w:r>
+    </w:p>
+    <w:p>
+      <w:pPr>
+        <w:pStyle w:val="Code"/>
+        <w:rPr>
+          <w:rFonts w:ascii="Courier New" w:hAnsi="Courier New"/>
+        </w:rPr>
+      </w:pPr>
+      <w:r>
+        <w:rPr>
+          <w:rFonts w:ascii="Courier New" w:hAnsi="Courier New"/>
+        </w:rPr>
+        <w:t xml:space="preserve">      </w:t>
+      </w:r>
+      <w:r>
+        <w:rPr>
+          <w:rFonts w:ascii="Courier New" w:hAnsi="Courier New"/>
+          <w:sz w:val="21"/>
+        </w:rPr>
+        <w:t>&lt;/section&gt;</w:t>
+      </w:r>
+    </w:p>
+    <w:p>
+      <w:pPr>
+        <w:pStyle w:val="Code"/>
+        <w:rPr>
+          <w:rFonts w:ascii="Courier New" w:hAnsi="Courier New"/>
+        </w:rPr>
+      </w:pPr>
+      <w:r>
+        <w:rPr>
+          <w:rFonts w:ascii="Courier New" w:hAnsi="Courier New"/>
+        </w:rPr>
+        <w:t xml:space="preserve">    </w:t>
+      </w:r>
+      <w:r>
+        <w:rPr>
+          <w:rFonts w:ascii="Courier New" w:hAnsi="Courier New"/>
+          <w:sz w:val="21"/>
+        </w:rPr>
+        <w:t>&lt;/div&gt;</w:t>
+      </w:r>
+    </w:p>
+    <w:p>
+      <w:pPr>
+        <w:pStyle w:val="Code"/>
+        <w:rPr>
+          <w:rFonts w:ascii="Courier New" w:hAnsi="Courier New"/>
+        </w:rPr>
+      </w:pPr>
+      <w:r>
+        <w:rPr>
+          <w:rFonts w:ascii="Courier New" w:hAnsi="Courier New"/>
+        </w:rPr>
+        <w:t xml:space="preserve">  </w:t>
+      </w:r>
+      <w:r>
+        <w:rPr>
+          <w:rFonts w:ascii="Courier New" w:hAnsi="Courier New"/>
+          <w:sz w:val="21"/>
+        </w:rPr>
+        <w:t>);</w:t>
+      </w:r>
+    </w:p>
+    <w:p>
+      <w:pPr>
+        <w:pStyle w:val="Code"/>
+        <w:rPr>
+          <w:rFonts w:ascii="Courier New" w:hAnsi="Courier New"/>
+        </w:rPr>
+      </w:pPr>
+      <w:r>
+        <w:rPr>
+          <w:rFonts w:ascii="Courier New" w:hAnsi="Courier New"/>
+        </w:rPr>
+        <w:t>}</w:t>
+      </w:r>
+    </w:p>
+    <w:p>
+      <w:pPr>
+        <w:pStyle w:val="P1"/>
+        <w:rPr>
+          <w:b w:val="false"/>
+          <w:bCs w:val="false"/>
+          <w:color w:val="auto"/>
+        </w:rPr>
+      </w:pPr>
+      <w:r>
+        <w:rPr>
+          <w:b w:val="false"/>
+          <w:bCs w:val="false"/>
+          <w:color w:val="auto"/>
+        </w:rPr>
+      </w:r>
+    </w:p>
+    <w:p>
+      <w:pPr>
+        <w:pStyle w:val="H3"/>
+        <w:rPr/>
+      </w:pPr>
+      <w:r>
+        <w:rPr/>
+        <w:t>Двухпоточний Монтгомері</w:t>
+      </w:r>
+    </w:p>
+    <w:p>
+      <w:pPr>
+        <w:pStyle w:val="H3"/>
+        <w:rPr/>
+      </w:pPr>
+      <w:r>
+        <w:rPr/>
+        <w:t>Метод гребеня</w:t>
+      </w:r>
+    </w:p>
+    <w:p>
+      <w:pPr>
         <w:pStyle w:val="H2"/>
         <w:rPr/>
       </w:pPr>
       <w:r>
         <w:rPr/>
+        <w:t xml:space="preserve">3 </w:t>
+      </w:r>
+      <w:r>
+        <w:rPr/>
         <w:t>Результати роботи</w:t>
+      </w:r>
+    </w:p>
+    <w:p>
+      <w:pPr>
+        <w:pStyle w:val="H3"/>
+        <w:rPr/>
+      </w:pPr>
+      <w:r>
+        <w:rPr/>
+        <w:t>Бінарний модуль</w:t>
+      </w:r>
+    </w:p>
+    <w:p>
+      <w:pPr>
+        <w:pStyle w:val="P1"/>
+        <w:rPr/>
+      </w:pPr>
+      <w:r>
+        <w:rPr/>
+      </w:r>
+    </w:p>
+    <w:p>
+      <w:pPr>
+        <w:pStyle w:val="P1"/>
+        <w:rPr/>
+      </w:pPr>
+      <w:r>
+        <w:rPr/>
+        <w:t>Результати виконання програми наведено на рисунку нижче:</w:t>
+      </w:r>
+    </w:p>
+    <w:p>
+      <w:pPr>
+        <w:pStyle w:val="img1"/>
+        <w:rPr/>
+      </w:pPr>
+      <w:r>
+        <w:rPr/>
+      </w:r>
+    </w:p>
+    <w:p>
+      <w:pPr>
+        <w:pStyle w:val="img1"/>
+        <w:rPr/>
+      </w:pPr>
+      <w:r>
+        <w:rPr/>
+        <w:drawing>
+          <wp:inline distT="0" distB="0" distL="0" distR="0">
+            <wp:extent cx="5731510" cy="6226175"/>
+            <wp:effectExtent l="0" t="0" r="0" b="0"/>
+            <wp:docPr id="2" name="Зображення2"/>
+            <wp:cNvGraphicFramePr>
+              <a:graphicFrameLocks xmlns:a="http://schemas.openxmlformats.org/drawingml/2006/main" noChangeAspect="1"/>
+            </wp:cNvGraphicFramePr>
+            <a:graphic xmlns:a="http://schemas.openxmlformats.org/drawingml/2006/main">
+              <a:graphicData uri="http://schemas.openxmlformats.org/drawingml/2006/picture">
+                <pic:pic xmlns:pic="http://schemas.openxmlformats.org/drawingml/2006/picture">
+                  <pic:nvPicPr>
+                    <pic:cNvPr id="2" name="Зображення2"/>
+                    <pic:cNvPicPr>
+                      <a:picLocks noChangeAspect="1" noChangeArrowheads="1"/>
+                    </pic:cNvPicPr>
+                  </pic:nvPicPr>
+                  <pic:blipFill>
+                    <a:blip r:embed="rId4"/>
+                    <a:stretch>
+                      <a:fillRect/>
+                    </a:stretch>
+                  </pic:blipFill>
+                  <pic:spPr bwMode="auto">
+                    <a:xfrm>
+                      <a:off x="0" y="0"/>
+                      <a:ext cx="5731510" cy="6226175"/>
+                    </a:xfrm>
+                    <a:prstGeom prst="rect">
+                      <a:avLst/>
+                    </a:prstGeom>
+                    <a:noFill/>
+                  </pic:spPr>
+                </pic:pic>
+              </a:graphicData>
+            </a:graphic>
+          </wp:inline>
+        </w:drawing>
+      </w:r>
+    </w:p>
+    <w:p>
+      <w:pPr>
+        <w:pStyle w:val="img1"/>
+        <w:rPr/>
+      </w:pPr>
+      <w:r>
+        <w:rPr/>
+        <w:t>Рисунок 3.1 — Вигляд застосунку із заповненими даними</w:t>
+      </w:r>
+    </w:p>
+    <w:p>
+      <w:pPr>
+        <w:pStyle w:val="P1"/>
+        <w:rPr/>
+      </w:pPr>
+      <w:r>
+        <w:rPr/>
+      </w:r>
+    </w:p>
+    <w:p>
+      <w:pPr>
+        <w:pStyle w:val="H3"/>
+        <w:rPr/>
+      </w:pPr>
+      <w:r>
+        <w:rPr/>
+        <w:t>Двухпоточний Монтгомері</w:t>
+      </w:r>
+    </w:p>
+    <w:p>
+      <w:pPr>
+        <w:pStyle w:val="P1"/>
+        <w:rPr/>
+      </w:pPr>
+      <w:r>
+        <w:rPr/>
+      </w:r>
+    </w:p>
+    <w:p>
+      <w:pPr>
+        <w:pStyle w:val="P1"/>
+        <w:rPr/>
+      </w:pPr>
+      <w:r>
+        <w:rPr/>
+        <w:t>Результати виконання програми наведено на рисунку нижче:</w:t>
+      </w:r>
+    </w:p>
+    <w:p>
+      <w:pPr>
+        <w:pStyle w:val="P1"/>
+        <w:rPr/>
+      </w:pPr>
+      <w:r>
+        <w:rPr/>
+      </w:r>
+    </w:p>
+    <w:p>
+      <w:pPr>
+        <w:pStyle w:val="H3"/>
+        <w:rPr/>
+      </w:pPr>
+      <w:r>
+        <w:rPr/>
+        <w:t>Метод гребеня</w:t>
+      </w:r>
+    </w:p>
+    <w:p>
+      <w:pPr>
+        <w:pStyle w:val="P1"/>
+        <w:rPr/>
+      </w:pPr>
+      <w:r>
+        <w:rPr/>
+      </w:r>
+    </w:p>
+    <w:p>
+      <w:pPr>
+        <w:pStyle w:val="P1"/>
+        <w:rPr/>
+      </w:pPr>
+      <w:r>
+        <w:rPr/>
+        <w:t>Результати виконання програми наведено на рисунку нижче:</w:t>
+      </w:r>
+    </w:p>
+    <w:p>
+      <w:pPr>
+        <w:pStyle w:val="P1"/>
+        <w:rPr/>
+      </w:pPr>
+      <w:r>
+        <w:rPr/>
+      </w:r>
+    </w:p>
+    <w:p>
+      <w:pPr>
+        <w:pStyle w:val="P1"/>
+        <w:rPr/>
+      </w:pPr>
+      <w:r>
+        <w:rPr/>
       </w:r>
     </w:p>
     <w:p>
@@ -1591,7 +3959,9 @@
     <w:link w:val="H3Char"/>
     <w:qFormat/>
     <w:rsid w:val="00dc3221"/>
-    <w:pPr/>
+    <w:pPr>
+      <w:spacing w:before="0" w:after="0"/>
+    </w:pPr>
     <w:rPr>
       <w:rFonts w:ascii="Times New Roman" w:hAnsi="Times New Roman" w:cs="Times New Roman"/>
       <w:b/>
@@ -1630,7 +4000,10 @@
     <w:pPr>
       <w:outlineLvl w:val="3"/>
     </w:pPr>
-    <w:rPr/>
+    <w:rPr>
+      <w:b w:val="false"/>
+      <w:bCs w:val="false"/>
+    </w:rPr>
   </w:style>
   <w:style w:type="paragraph" w:styleId="HTMLPreformatted">
     <w:name w:val="HTML Preformatted"/>

</xml_diff>

<commit_message>
fix (TR): remove errors in Visual Studio for the ThreadWar file
</commit_message>
<xml_diff>
--- a/42TR Tehnologiji Rozpodilenyh System/2/TR_KNT-122_Onyshchenko_19_PR2.docx
+++ b/42TR Tehnologiji Rozpodilenyh System/2/TR_KNT-122_Onyshchenko_19_PR2.docx
@@ -441,16 +441,16 @@
     </w:p>
     <w:p>
       <w:pPr>
-        <w:pStyle w:val="p11"/>
-        <w:rPr/>
-      </w:pPr>
-      <w:r>
-        <w:rPr/>
-      </w:r>
-    </w:p>
-    <w:p>
-      <w:pPr>
-        <w:pStyle w:val="p11"/>
+        <w:pStyle w:val="P1"/>
+        <w:rPr/>
+      </w:pPr>
+      <w:r>
+        <w:rPr/>
+      </w:r>
+    </w:p>
+    <w:p>
+      <w:pPr>
+        <w:pStyle w:val="P1"/>
         <w:rPr/>
       </w:pPr>
       <w:r>

</xml_diff>

<commit_message>
docs (TR): fill in the control questions for TR2
</commit_message>
<xml_diff>
--- a/42TR Tehnologiji Rozpodilenyh System/2/TR_KNT-122_Onyshchenko_19_PR2.docx
+++ b/42TR Tehnologiji Rozpodilenyh System/2/TR_KNT-122_Onyshchenko_19_PR2.docx
@@ -409,15 +409,7 @@
       </w:pPr>
       <w:r>
         <w:rPr/>
-        <w:t xml:space="preserve">Метою роботи є одержати </w:t>
-      </w:r>
-      <w:r>
-        <w:rPr/>
-        <w:t>н</w:t>
-      </w:r>
-      <w:r>
-        <w:rPr/>
-        <w:t>авички програмування багатопоточних додатків в WIN32 на прикладі алгоритмів модульного піднесення до степені.</w:t>
+        <w:t>Метою роботи є одержати навички програмування багатопоточних додатків в WIN32 на прикладі алгоритмів модульного піднесення до степені.</w:t>
       </w:r>
     </w:p>
     <w:p>
@@ -524,11 +516,7 @@
       </w:pPr>
       <w:r>
         <w:rPr/>
-        <w:t xml:space="preserve">1 </w:t>
-      </w:r>
-      <w:r>
-        <w:rPr/>
-        <w:t>Графи алгоритмів</w:t>
+        <w:t>1 Графи алгоритмів</w:t>
       </w:r>
     </w:p>
     <w:p>
@@ -660,11 +648,7 @@
       </w:pPr>
       <w:r>
         <w:rPr/>
-        <w:t xml:space="preserve">2 </w:t>
-      </w:r>
-      <w:r>
-        <w:rPr/>
-        <w:t>Тексти програми</w:t>
+        <w:t>2 Тексти програми</w:t>
       </w:r>
     </w:p>
     <w:p>
@@ -1013,9 +997,7 @@
         </w:rPr>
       </w:pPr>
       <w:r>
-        <w:rPr>
-          <w:rFonts w:ascii="Courier New" w:hAnsi="Courier New"/>
-        </w:rPr>
+        <w:rPr/>
         <w:t>"use client";</w:t>
       </w:r>
     </w:p>
@@ -1027,22 +1009,18 @@
         </w:rPr>
       </w:pPr>
       <w:r>
-        <w:rPr>
-          <w:rFonts w:ascii="Courier New" w:hAnsi="Courier New"/>
-        </w:rPr>
-      </w:r>
-    </w:p>
-    <w:p>
-      <w:pPr>
-        <w:pStyle w:val="Code"/>
-        <w:rPr>
-          <w:rFonts w:ascii="Courier New" w:hAnsi="Courier New"/>
-        </w:rPr>
-      </w:pPr>
-      <w:r>
-        <w:rPr>
-          <w:rFonts w:ascii="Courier New" w:hAnsi="Courier New"/>
-        </w:rPr>
+        <w:rPr/>
+      </w:r>
+    </w:p>
+    <w:p>
+      <w:pPr>
+        <w:pStyle w:val="Code"/>
+        <w:rPr>
+          <w:rFonts w:ascii="Courier New" w:hAnsi="Courier New"/>
+        </w:rPr>
+      </w:pPr>
+      <w:r>
+        <w:rPr/>
         <w:t>import { powerModular } from "@/helper/main";</w:t>
       </w:r>
     </w:p>
@@ -1054,9 +1032,7 @@
         </w:rPr>
       </w:pPr>
       <w:r>
-        <w:rPr>
-          <w:rFonts w:ascii="Courier New" w:hAnsi="Courier New"/>
-        </w:rPr>
+        <w:rPr/>
         <w:t>import { FormEvent, useState } from "react";</w:t>
       </w:r>
     </w:p>
@@ -1068,22 +1044,18 @@
         </w:rPr>
       </w:pPr>
       <w:r>
-        <w:rPr>
-          <w:rFonts w:ascii="Courier New" w:hAnsi="Courier New"/>
-        </w:rPr>
-      </w:r>
-    </w:p>
-    <w:p>
-      <w:pPr>
-        <w:pStyle w:val="Code"/>
-        <w:rPr>
-          <w:rFonts w:ascii="Courier New" w:hAnsi="Courier New"/>
-        </w:rPr>
-      </w:pPr>
-      <w:r>
-        <w:rPr>
-          <w:rFonts w:ascii="Courier New" w:hAnsi="Courier New"/>
-        </w:rPr>
+        <w:rPr/>
+      </w:r>
+    </w:p>
+    <w:p>
+      <w:pPr>
+        <w:pStyle w:val="Code"/>
+        <w:rPr>
+          <w:rFonts w:ascii="Courier New" w:hAnsi="Courier New"/>
+        </w:rPr>
+      </w:pPr>
+      <w:r>
+        <w:rPr/>
         <w:t>export default function Home() {</w:t>
       </w:r>
     </w:p>
@@ -1095,14 +1067,11 @@
         </w:rPr>
       </w:pPr>
       <w:r>
-        <w:rPr>
-          <w:rFonts w:ascii="Courier New" w:hAnsi="Courier New"/>
-        </w:rPr>
+        <w:rPr/>
         <w:t xml:space="preserve">  </w:t>
       </w:r>
       <w:r>
         <w:rPr>
-          <w:rFonts w:ascii="Courier New" w:hAnsi="Courier New"/>
           <w:sz w:val="21"/>
         </w:rPr>
         <w:t>const [result, setResult] = useState(0);</w:t>
@@ -1116,27 +1085,22 @@
         </w:rPr>
       </w:pPr>
       <w:r>
-        <w:rPr>
-          <w:rFonts w:ascii="Courier New" w:hAnsi="Courier New"/>
-        </w:rPr>
-      </w:r>
-    </w:p>
-    <w:p>
-      <w:pPr>
-        <w:pStyle w:val="Code"/>
-        <w:rPr>
-          <w:rFonts w:ascii="Courier New" w:hAnsi="Courier New"/>
-        </w:rPr>
-      </w:pPr>
-      <w:r>
-        <w:rPr>
-          <w:rFonts w:ascii="Courier New" w:hAnsi="Courier New"/>
-        </w:rPr>
+        <w:rPr/>
+      </w:r>
+    </w:p>
+    <w:p>
+      <w:pPr>
+        <w:pStyle w:val="Code"/>
+        <w:rPr>
+          <w:rFonts w:ascii="Courier New" w:hAnsi="Courier New"/>
+        </w:rPr>
+      </w:pPr>
+      <w:r>
+        <w:rPr/>
         <w:t xml:space="preserve">  </w:t>
       </w:r>
       <w:r>
         <w:rPr>
-          <w:rFonts w:ascii="Courier New" w:hAnsi="Courier New"/>
           <w:sz w:val="21"/>
         </w:rPr>
         <w:t>const [base, setBase] = useState(0);</w:t>
@@ -1150,14 +1114,11 @@
         </w:rPr>
       </w:pPr>
       <w:r>
-        <w:rPr>
-          <w:rFonts w:ascii="Courier New" w:hAnsi="Courier New"/>
-        </w:rPr>
+        <w:rPr/>
         <w:t xml:space="preserve">  </w:t>
       </w:r>
       <w:r>
         <w:rPr>
-          <w:rFonts w:ascii="Courier New" w:hAnsi="Courier New"/>
           <w:sz w:val="21"/>
         </w:rPr>
         <w:t>const [exponent, setExponent] = useState(0);</w:t>
@@ -1171,14 +1132,11 @@
         </w:rPr>
       </w:pPr>
       <w:r>
-        <w:rPr>
-          <w:rFonts w:ascii="Courier New" w:hAnsi="Courier New"/>
-        </w:rPr>
+        <w:rPr/>
         <w:t xml:space="preserve">  </w:t>
       </w:r>
       <w:r>
         <w:rPr>
-          <w:rFonts w:ascii="Courier New" w:hAnsi="Courier New"/>
           <w:sz w:val="21"/>
         </w:rPr>
         <w:t>const [modulus, setModulus] = useState(0);</w:t>
@@ -1192,27 +1150,22 @@
         </w:rPr>
       </w:pPr>
       <w:r>
-        <w:rPr>
-          <w:rFonts w:ascii="Courier New" w:hAnsi="Courier New"/>
-        </w:rPr>
-      </w:r>
-    </w:p>
-    <w:p>
-      <w:pPr>
-        <w:pStyle w:val="Code"/>
-        <w:rPr>
-          <w:rFonts w:ascii="Courier New" w:hAnsi="Courier New"/>
-        </w:rPr>
-      </w:pPr>
-      <w:r>
-        <w:rPr>
-          <w:rFonts w:ascii="Courier New" w:hAnsi="Courier New"/>
-        </w:rPr>
+        <w:rPr/>
+      </w:r>
+    </w:p>
+    <w:p>
+      <w:pPr>
+        <w:pStyle w:val="Code"/>
+        <w:rPr>
+          <w:rFonts w:ascii="Courier New" w:hAnsi="Courier New"/>
+        </w:rPr>
+      </w:pPr>
+      <w:r>
+        <w:rPr/>
         <w:t xml:space="preserve">  </w:t>
       </w:r>
       <w:r>
         <w:rPr>
-          <w:rFonts w:ascii="Courier New" w:hAnsi="Courier New"/>
           <w:sz w:val="21"/>
         </w:rPr>
         <w:t>const handleSubmit = (e: FormEvent) =&gt; {</w:t>
@@ -1226,14 +1179,11 @@
         </w:rPr>
       </w:pPr>
       <w:r>
-        <w:rPr>
-          <w:rFonts w:ascii="Courier New" w:hAnsi="Courier New"/>
-        </w:rPr>
+        <w:rPr/>
         <w:t xml:space="preserve">    </w:t>
       </w:r>
       <w:r>
         <w:rPr>
-          <w:rFonts w:ascii="Courier New" w:hAnsi="Courier New"/>
           <w:sz w:val="21"/>
         </w:rPr>
         <w:t>e.preventDefault();</w:t>
@@ -1247,27 +1197,22 @@
         </w:rPr>
       </w:pPr>
       <w:r>
-        <w:rPr>
-          <w:rFonts w:ascii="Courier New" w:hAnsi="Courier New"/>
-        </w:rPr>
-      </w:r>
-    </w:p>
-    <w:p>
-      <w:pPr>
-        <w:pStyle w:val="Code"/>
-        <w:rPr>
-          <w:rFonts w:ascii="Courier New" w:hAnsi="Courier New"/>
-        </w:rPr>
-      </w:pPr>
-      <w:r>
-        <w:rPr>
-          <w:rFonts w:ascii="Courier New" w:hAnsi="Courier New"/>
-        </w:rPr>
+        <w:rPr/>
+      </w:r>
+    </w:p>
+    <w:p>
+      <w:pPr>
+        <w:pStyle w:val="Code"/>
+        <w:rPr>
+          <w:rFonts w:ascii="Courier New" w:hAnsi="Courier New"/>
+        </w:rPr>
+      </w:pPr>
+      <w:r>
+        <w:rPr/>
         <w:t xml:space="preserve">    </w:t>
       </w:r>
       <w:r>
         <w:rPr>
-          <w:rFonts w:ascii="Courier New" w:hAnsi="Courier New"/>
           <w:sz w:val="21"/>
         </w:rPr>
         <w:t>setResult(powerModular(base, exponent, modulus));</w:t>
@@ -1281,14 +1226,11 @@
         </w:rPr>
       </w:pPr>
       <w:r>
-        <w:rPr>
-          <w:rFonts w:ascii="Courier New" w:hAnsi="Courier New"/>
-        </w:rPr>
+        <w:rPr/>
         <w:t xml:space="preserve">  </w:t>
       </w:r>
       <w:r>
         <w:rPr>
-          <w:rFonts w:ascii="Courier New" w:hAnsi="Courier New"/>
           <w:sz w:val="21"/>
         </w:rPr>
         <w:t>};</w:t>
@@ -1302,27 +1244,22 @@
         </w:rPr>
       </w:pPr>
       <w:r>
-        <w:rPr>
-          <w:rFonts w:ascii="Courier New" w:hAnsi="Courier New"/>
-        </w:rPr>
-      </w:r>
-    </w:p>
-    <w:p>
-      <w:pPr>
-        <w:pStyle w:val="Code"/>
-        <w:rPr>
-          <w:rFonts w:ascii="Courier New" w:hAnsi="Courier New"/>
-        </w:rPr>
-      </w:pPr>
-      <w:r>
-        <w:rPr>
-          <w:rFonts w:ascii="Courier New" w:hAnsi="Courier New"/>
-        </w:rPr>
+        <w:rPr/>
+      </w:r>
+    </w:p>
+    <w:p>
+      <w:pPr>
+        <w:pStyle w:val="Code"/>
+        <w:rPr>
+          <w:rFonts w:ascii="Courier New" w:hAnsi="Courier New"/>
+        </w:rPr>
+      </w:pPr>
+      <w:r>
+        <w:rPr/>
         <w:t xml:space="preserve">  </w:t>
       </w:r>
       <w:r>
         <w:rPr>
-          <w:rFonts w:ascii="Courier New" w:hAnsi="Courier New"/>
           <w:sz w:val="21"/>
         </w:rPr>
         <w:t>return (</w:t>
@@ -1336,14 +1273,11 @@
         </w:rPr>
       </w:pPr>
       <w:r>
-        <w:rPr>
-          <w:rFonts w:ascii="Courier New" w:hAnsi="Courier New"/>
-        </w:rPr>
+        <w:rPr/>
         <w:t xml:space="preserve">    </w:t>
       </w:r>
       <w:r>
         <w:rPr>
-          <w:rFonts w:ascii="Courier New" w:hAnsi="Courier New"/>
           <w:sz w:val="21"/>
         </w:rPr>
         <w:t>&lt;div className="min-h-screen bg-linear-to-br to-sky-50 p-3 flex flex-col gap-3 items-center justify-center"&gt;</w:t>
@@ -1357,14 +1291,11 @@
         </w:rPr>
       </w:pPr>
       <w:r>
-        <w:rPr>
-          <w:rFonts w:ascii="Courier New" w:hAnsi="Courier New"/>
-        </w:rPr>
+        <w:rPr/>
         <w:t xml:space="preserve">      </w:t>
       </w:r>
       <w:r>
         <w:rPr>
-          <w:rFonts w:ascii="Courier New" w:hAnsi="Courier New"/>
           <w:sz w:val="21"/>
         </w:rPr>
         <w:t>&lt;section className="bg-white rounded-md p-3 flex flex-col w-64"&gt;</w:t>
@@ -1378,14 +1309,11 @@
         </w:rPr>
       </w:pPr>
       <w:r>
-        <w:rPr>
-          <w:rFonts w:ascii="Courier New" w:hAnsi="Courier New"/>
-        </w:rPr>
+        <w:rPr/>
         <w:t xml:space="preserve">        </w:t>
       </w:r>
       <w:r>
         <w:rPr>
-          <w:rFonts w:ascii="Courier New" w:hAnsi="Courier New"/>
           <w:sz w:val="21"/>
         </w:rPr>
         <w:t>&lt;h1 className="font-bold"&gt;TR2. Binary Exponent&lt;/h1&gt;</w:t>
@@ -1399,14 +1327,11 @@
         </w:rPr>
       </w:pPr>
       <w:r>
-        <w:rPr>
-          <w:rFonts w:ascii="Courier New" w:hAnsi="Courier New"/>
-        </w:rPr>
+        <w:rPr/>
         <w:t xml:space="preserve">      </w:t>
       </w:r>
       <w:r>
         <w:rPr>
-          <w:rFonts w:ascii="Courier New" w:hAnsi="Courier New"/>
           <w:sz w:val="21"/>
         </w:rPr>
         <w:t>&lt;/section&gt;</w:t>
@@ -1420,14 +1345,11 @@
         </w:rPr>
       </w:pPr>
       <w:r>
-        <w:rPr>
-          <w:rFonts w:ascii="Courier New" w:hAnsi="Courier New"/>
-        </w:rPr>
+        <w:rPr/>
         <w:t xml:space="preserve">      </w:t>
       </w:r>
       <w:r>
         <w:rPr>
-          <w:rFonts w:ascii="Courier New" w:hAnsi="Courier New"/>
           <w:sz w:val="21"/>
         </w:rPr>
         <w:t>&lt;section className="bg-white rounded-md p-3 flex flex-col w-64"&gt;</w:t>
@@ -1441,14 +1363,11 @@
         </w:rPr>
       </w:pPr>
       <w:r>
-        <w:rPr>
-          <w:rFonts w:ascii="Courier New" w:hAnsi="Courier New"/>
-        </w:rPr>
+        <w:rPr/>
         <w:t xml:space="preserve">        </w:t>
       </w:r>
       <w:r>
         <w:rPr>
-          <w:rFonts w:ascii="Courier New" w:hAnsi="Courier New"/>
           <w:sz w:val="21"/>
         </w:rPr>
         <w:t>&lt;form className="flex flex-col gap-3" onSubmit={handleSubmit}&gt;</w:t>
@@ -1462,14 +1381,11 @@
         </w:rPr>
       </w:pPr>
       <w:r>
-        <w:rPr>
-          <w:rFonts w:ascii="Courier New" w:hAnsi="Courier New"/>
-        </w:rPr>
+        <w:rPr/>
         <w:t xml:space="preserve">          </w:t>
       </w:r>
       <w:r>
         <w:rPr>
-          <w:rFonts w:ascii="Courier New" w:hAnsi="Courier New"/>
           <w:sz w:val="21"/>
         </w:rPr>
         <w:t>&lt;div className="flex flex-col gap-1"&gt;</w:t>
@@ -1483,14 +1399,11 @@
         </w:rPr>
       </w:pPr>
       <w:r>
-        <w:rPr>
-          <w:rFonts w:ascii="Courier New" w:hAnsi="Courier New"/>
-        </w:rPr>
+        <w:rPr/>
         <w:t xml:space="preserve">            </w:t>
       </w:r>
       <w:r>
         <w:rPr>
-          <w:rFonts w:ascii="Courier New" w:hAnsi="Courier New"/>
           <w:sz w:val="21"/>
         </w:rPr>
         <w:t>&lt;label htmlFor="baseInput" className="label"&gt;</w:t>
@@ -1504,14 +1417,11 @@
         </w:rPr>
       </w:pPr>
       <w:r>
-        <w:rPr>
-          <w:rFonts w:ascii="Courier New" w:hAnsi="Courier New"/>
-        </w:rPr>
+        <w:rPr/>
         <w:t xml:space="preserve">              </w:t>
       </w:r>
       <w:r>
         <w:rPr>
-          <w:rFonts w:ascii="Courier New" w:hAnsi="Courier New"/>
           <w:sz w:val="21"/>
         </w:rPr>
         <w:t>Base</w:t>
@@ -1525,14 +1435,11 @@
         </w:rPr>
       </w:pPr>
       <w:r>
-        <w:rPr>
-          <w:rFonts w:ascii="Courier New" w:hAnsi="Courier New"/>
-        </w:rPr>
+        <w:rPr/>
         <w:t xml:space="preserve">            </w:t>
       </w:r>
       <w:r>
         <w:rPr>
-          <w:rFonts w:ascii="Courier New" w:hAnsi="Courier New"/>
           <w:sz w:val="21"/>
         </w:rPr>
         <w:t>&lt;/label&gt;</w:t>
@@ -1546,14 +1453,11 @@
         </w:rPr>
       </w:pPr>
       <w:r>
-        <w:rPr>
-          <w:rFonts w:ascii="Courier New" w:hAnsi="Courier New"/>
-        </w:rPr>
+        <w:rPr/>
         <w:t xml:space="preserve">            </w:t>
       </w:r>
       <w:r>
         <w:rPr>
-          <w:rFonts w:ascii="Courier New" w:hAnsi="Courier New"/>
           <w:sz w:val="21"/>
         </w:rPr>
         <w:t>&lt;input</w:t>
@@ -1567,14 +1471,11 @@
         </w:rPr>
       </w:pPr>
       <w:r>
-        <w:rPr>
-          <w:rFonts w:ascii="Courier New" w:hAnsi="Courier New"/>
-        </w:rPr>
+        <w:rPr/>
         <w:t xml:space="preserve">              </w:t>
       </w:r>
       <w:r>
         <w:rPr>
-          <w:rFonts w:ascii="Courier New" w:hAnsi="Courier New"/>
           <w:sz w:val="21"/>
         </w:rPr>
         <w:t>id="baseInput"</w:t>
@@ -1588,14 +1489,11 @@
         </w:rPr>
       </w:pPr>
       <w:r>
-        <w:rPr>
-          <w:rFonts w:ascii="Courier New" w:hAnsi="Courier New"/>
-        </w:rPr>
+        <w:rPr/>
         <w:t xml:space="preserve">              </w:t>
       </w:r>
       <w:r>
         <w:rPr>
-          <w:rFonts w:ascii="Courier New" w:hAnsi="Courier New"/>
           <w:sz w:val="21"/>
         </w:rPr>
         <w:t>className="input"</w:t>
@@ -1609,14 +1507,11 @@
         </w:rPr>
       </w:pPr>
       <w:r>
-        <w:rPr>
-          <w:rFonts w:ascii="Courier New" w:hAnsi="Courier New"/>
-        </w:rPr>
+        <w:rPr/>
         <w:t xml:space="preserve">              </w:t>
       </w:r>
       <w:r>
         <w:rPr>
-          <w:rFonts w:ascii="Courier New" w:hAnsi="Courier New"/>
           <w:sz w:val="21"/>
         </w:rPr>
         <w:t>type="text"</w:t>
@@ -1630,14 +1525,11 @@
         </w:rPr>
       </w:pPr>
       <w:r>
-        <w:rPr>
-          <w:rFonts w:ascii="Courier New" w:hAnsi="Courier New"/>
-        </w:rPr>
+        <w:rPr/>
         <w:t xml:space="preserve">              </w:t>
       </w:r>
       <w:r>
         <w:rPr>
-          <w:rFonts w:ascii="Courier New" w:hAnsi="Courier New"/>
           <w:sz w:val="21"/>
         </w:rPr>
         <w:t>value={base}</w:t>
@@ -1651,14 +1543,11 @@
         </w:rPr>
       </w:pPr>
       <w:r>
-        <w:rPr>
-          <w:rFonts w:ascii="Courier New" w:hAnsi="Courier New"/>
-        </w:rPr>
+        <w:rPr/>
         <w:t xml:space="preserve">              </w:t>
       </w:r>
       <w:r>
         <w:rPr>
-          <w:rFonts w:ascii="Courier New" w:hAnsi="Courier New"/>
           <w:sz w:val="21"/>
         </w:rPr>
         <w:t>onChange={(e) =&gt; setBase(+e.target.value)}</w:t>
@@ -1672,14 +1561,11 @@
         </w:rPr>
       </w:pPr>
       <w:r>
-        <w:rPr>
-          <w:rFonts w:ascii="Courier New" w:hAnsi="Courier New"/>
-        </w:rPr>
+        <w:rPr/>
         <w:t xml:space="preserve">            </w:t>
       </w:r>
       <w:r>
         <w:rPr>
-          <w:rFonts w:ascii="Courier New" w:hAnsi="Courier New"/>
           <w:sz w:val="21"/>
         </w:rPr>
         <w:t>/&gt;</w:t>
@@ -1693,14 +1579,11 @@
         </w:rPr>
       </w:pPr>
       <w:r>
-        <w:rPr>
-          <w:rFonts w:ascii="Courier New" w:hAnsi="Courier New"/>
-        </w:rPr>
+        <w:rPr/>
         <w:t xml:space="preserve">          </w:t>
       </w:r>
       <w:r>
         <w:rPr>
-          <w:rFonts w:ascii="Courier New" w:hAnsi="Courier New"/>
           <w:sz w:val="21"/>
         </w:rPr>
         <w:t>&lt;/div&gt;</w:t>
@@ -1714,27 +1597,22 @@
         </w:rPr>
       </w:pPr>
       <w:r>
-        <w:rPr>
-          <w:rFonts w:ascii="Courier New" w:hAnsi="Courier New"/>
-        </w:rPr>
-      </w:r>
-    </w:p>
-    <w:p>
-      <w:pPr>
-        <w:pStyle w:val="Code"/>
-        <w:rPr>
-          <w:rFonts w:ascii="Courier New" w:hAnsi="Courier New"/>
-        </w:rPr>
-      </w:pPr>
-      <w:r>
-        <w:rPr>
-          <w:rFonts w:ascii="Courier New" w:hAnsi="Courier New"/>
-        </w:rPr>
+        <w:rPr/>
+      </w:r>
+    </w:p>
+    <w:p>
+      <w:pPr>
+        <w:pStyle w:val="Code"/>
+        <w:rPr>
+          <w:rFonts w:ascii="Courier New" w:hAnsi="Courier New"/>
+        </w:rPr>
+      </w:pPr>
+      <w:r>
+        <w:rPr/>
         <w:t xml:space="preserve">          </w:t>
       </w:r>
       <w:r>
         <w:rPr>
-          <w:rFonts w:ascii="Courier New" w:hAnsi="Courier New"/>
           <w:sz w:val="21"/>
         </w:rPr>
         <w:t>&lt;div className="flex flex-col gap-1"&gt;</w:t>
@@ -1748,14 +1626,11 @@
         </w:rPr>
       </w:pPr>
       <w:r>
-        <w:rPr>
-          <w:rFonts w:ascii="Courier New" w:hAnsi="Courier New"/>
-        </w:rPr>
+        <w:rPr/>
         <w:t xml:space="preserve">            </w:t>
       </w:r>
       <w:r>
         <w:rPr>
-          <w:rFonts w:ascii="Courier New" w:hAnsi="Courier New"/>
           <w:sz w:val="21"/>
         </w:rPr>
         <w:t>&lt;label htmlFor="exponentInput" className="label"&gt;</w:t>
@@ -1769,14 +1644,11 @@
         </w:rPr>
       </w:pPr>
       <w:r>
-        <w:rPr>
-          <w:rFonts w:ascii="Courier New" w:hAnsi="Courier New"/>
-        </w:rPr>
+        <w:rPr/>
         <w:t xml:space="preserve">              </w:t>
       </w:r>
       <w:r>
         <w:rPr>
-          <w:rFonts w:ascii="Courier New" w:hAnsi="Courier New"/>
           <w:sz w:val="21"/>
         </w:rPr>
         <w:t>Exponent</w:t>
@@ -1790,14 +1662,11 @@
         </w:rPr>
       </w:pPr>
       <w:r>
-        <w:rPr>
-          <w:rFonts w:ascii="Courier New" w:hAnsi="Courier New"/>
-        </w:rPr>
+        <w:rPr/>
         <w:t xml:space="preserve">            </w:t>
       </w:r>
       <w:r>
         <w:rPr>
-          <w:rFonts w:ascii="Courier New" w:hAnsi="Courier New"/>
           <w:sz w:val="21"/>
         </w:rPr>
         <w:t>&lt;/label&gt;</w:t>
@@ -1811,14 +1680,11 @@
         </w:rPr>
       </w:pPr>
       <w:r>
-        <w:rPr>
-          <w:rFonts w:ascii="Courier New" w:hAnsi="Courier New"/>
-        </w:rPr>
+        <w:rPr/>
         <w:t xml:space="preserve">            </w:t>
       </w:r>
       <w:r>
         <w:rPr>
-          <w:rFonts w:ascii="Courier New" w:hAnsi="Courier New"/>
           <w:sz w:val="21"/>
         </w:rPr>
         <w:t>&lt;input</w:t>
@@ -1832,14 +1698,11 @@
         </w:rPr>
       </w:pPr>
       <w:r>
-        <w:rPr>
-          <w:rFonts w:ascii="Courier New" w:hAnsi="Courier New"/>
-        </w:rPr>
+        <w:rPr/>
         <w:t xml:space="preserve">              </w:t>
       </w:r>
       <w:r>
         <w:rPr>
-          <w:rFonts w:ascii="Courier New" w:hAnsi="Courier New"/>
           <w:sz w:val="21"/>
         </w:rPr>
         <w:t>id="exponentInput"</w:t>
@@ -1853,14 +1716,11 @@
         </w:rPr>
       </w:pPr>
       <w:r>
-        <w:rPr>
-          <w:rFonts w:ascii="Courier New" w:hAnsi="Courier New"/>
-        </w:rPr>
+        <w:rPr/>
         <w:t xml:space="preserve">              </w:t>
       </w:r>
       <w:r>
         <w:rPr>
-          <w:rFonts w:ascii="Courier New" w:hAnsi="Courier New"/>
           <w:sz w:val="21"/>
         </w:rPr>
         <w:t>className="input"</w:t>
@@ -1874,14 +1734,11 @@
         </w:rPr>
       </w:pPr>
       <w:r>
-        <w:rPr>
-          <w:rFonts w:ascii="Courier New" w:hAnsi="Courier New"/>
-        </w:rPr>
+        <w:rPr/>
         <w:t xml:space="preserve">              </w:t>
       </w:r>
       <w:r>
         <w:rPr>
-          <w:rFonts w:ascii="Courier New" w:hAnsi="Courier New"/>
           <w:sz w:val="21"/>
         </w:rPr>
         <w:t>type="text"</w:t>
@@ -1895,14 +1752,11 @@
         </w:rPr>
       </w:pPr>
       <w:r>
-        <w:rPr>
-          <w:rFonts w:ascii="Courier New" w:hAnsi="Courier New"/>
-        </w:rPr>
+        <w:rPr/>
         <w:t xml:space="preserve">              </w:t>
       </w:r>
       <w:r>
         <w:rPr>
-          <w:rFonts w:ascii="Courier New" w:hAnsi="Courier New"/>
           <w:sz w:val="21"/>
         </w:rPr>
         <w:t>value={exponent}</w:t>
@@ -1916,14 +1770,11 @@
         </w:rPr>
       </w:pPr>
       <w:r>
-        <w:rPr>
-          <w:rFonts w:ascii="Courier New" w:hAnsi="Courier New"/>
-        </w:rPr>
+        <w:rPr/>
         <w:t xml:space="preserve">              </w:t>
       </w:r>
       <w:r>
         <w:rPr>
-          <w:rFonts w:ascii="Courier New" w:hAnsi="Courier New"/>
           <w:sz w:val="21"/>
         </w:rPr>
         <w:t>onChange={(e) =&gt; setExponent(+e.target.value)}</w:t>
@@ -1937,14 +1788,11 @@
         </w:rPr>
       </w:pPr>
       <w:r>
-        <w:rPr>
-          <w:rFonts w:ascii="Courier New" w:hAnsi="Courier New"/>
-        </w:rPr>
+        <w:rPr/>
         <w:t xml:space="preserve">            </w:t>
       </w:r>
       <w:r>
         <w:rPr>
-          <w:rFonts w:ascii="Courier New" w:hAnsi="Courier New"/>
           <w:sz w:val="21"/>
         </w:rPr>
         <w:t>/&gt;</w:t>
@@ -1958,14 +1806,11 @@
         </w:rPr>
       </w:pPr>
       <w:r>
-        <w:rPr>
-          <w:rFonts w:ascii="Courier New" w:hAnsi="Courier New"/>
-        </w:rPr>
+        <w:rPr/>
         <w:t xml:space="preserve">          </w:t>
       </w:r>
       <w:r>
         <w:rPr>
-          <w:rFonts w:ascii="Courier New" w:hAnsi="Courier New"/>
           <w:sz w:val="21"/>
         </w:rPr>
         <w:t>&lt;/div&gt;</w:t>
@@ -1979,27 +1824,22 @@
         </w:rPr>
       </w:pPr>
       <w:r>
-        <w:rPr>
-          <w:rFonts w:ascii="Courier New" w:hAnsi="Courier New"/>
-        </w:rPr>
-      </w:r>
-    </w:p>
-    <w:p>
-      <w:pPr>
-        <w:pStyle w:val="Code"/>
-        <w:rPr>
-          <w:rFonts w:ascii="Courier New" w:hAnsi="Courier New"/>
-        </w:rPr>
-      </w:pPr>
-      <w:r>
-        <w:rPr>
-          <w:rFonts w:ascii="Courier New" w:hAnsi="Courier New"/>
-        </w:rPr>
+        <w:rPr/>
+      </w:r>
+    </w:p>
+    <w:p>
+      <w:pPr>
+        <w:pStyle w:val="Code"/>
+        <w:rPr>
+          <w:rFonts w:ascii="Courier New" w:hAnsi="Courier New"/>
+        </w:rPr>
+      </w:pPr>
+      <w:r>
+        <w:rPr/>
         <w:t xml:space="preserve">          </w:t>
       </w:r>
       <w:r>
         <w:rPr>
-          <w:rFonts w:ascii="Courier New" w:hAnsi="Courier New"/>
           <w:sz w:val="21"/>
         </w:rPr>
         <w:t>&lt;div className="flex flex-col gap-1"&gt;</w:t>
@@ -2013,14 +1853,11 @@
         </w:rPr>
       </w:pPr>
       <w:r>
-        <w:rPr>
-          <w:rFonts w:ascii="Courier New" w:hAnsi="Courier New"/>
-        </w:rPr>
+        <w:rPr/>
         <w:t xml:space="preserve">            </w:t>
       </w:r>
       <w:r>
         <w:rPr>
-          <w:rFonts w:ascii="Courier New" w:hAnsi="Courier New"/>
           <w:sz w:val="21"/>
         </w:rPr>
         <w:t>&lt;label htmlFor="modulusInput" className="label"&gt;</w:t>
@@ -2034,14 +1871,11 @@
         </w:rPr>
       </w:pPr>
       <w:r>
-        <w:rPr>
-          <w:rFonts w:ascii="Courier New" w:hAnsi="Courier New"/>
-        </w:rPr>
+        <w:rPr/>
         <w:t xml:space="preserve">              </w:t>
       </w:r>
       <w:r>
         <w:rPr>
-          <w:rFonts w:ascii="Courier New" w:hAnsi="Courier New"/>
           <w:sz w:val="21"/>
         </w:rPr>
         <w:t>Modulus</w:t>
@@ -2055,14 +1889,11 @@
         </w:rPr>
       </w:pPr>
       <w:r>
-        <w:rPr>
-          <w:rFonts w:ascii="Courier New" w:hAnsi="Courier New"/>
-        </w:rPr>
+        <w:rPr/>
         <w:t xml:space="preserve">            </w:t>
       </w:r>
       <w:r>
         <w:rPr>
-          <w:rFonts w:ascii="Courier New" w:hAnsi="Courier New"/>
           <w:sz w:val="21"/>
         </w:rPr>
         <w:t>&lt;/label&gt;</w:t>
@@ -2076,14 +1907,11 @@
         </w:rPr>
       </w:pPr>
       <w:r>
-        <w:rPr>
-          <w:rFonts w:ascii="Courier New" w:hAnsi="Courier New"/>
-        </w:rPr>
+        <w:rPr/>
         <w:t xml:space="preserve">            </w:t>
       </w:r>
       <w:r>
         <w:rPr>
-          <w:rFonts w:ascii="Courier New" w:hAnsi="Courier New"/>
           <w:sz w:val="21"/>
         </w:rPr>
         <w:t>&lt;input</w:t>
@@ -2097,14 +1925,11 @@
         </w:rPr>
       </w:pPr>
       <w:r>
-        <w:rPr>
-          <w:rFonts w:ascii="Courier New" w:hAnsi="Courier New"/>
-        </w:rPr>
+        <w:rPr/>
         <w:t xml:space="preserve">              </w:t>
       </w:r>
       <w:r>
         <w:rPr>
-          <w:rFonts w:ascii="Courier New" w:hAnsi="Courier New"/>
           <w:sz w:val="21"/>
         </w:rPr>
         <w:t>id="modulusInput"</w:t>
@@ -2118,14 +1943,11 @@
         </w:rPr>
       </w:pPr>
       <w:r>
-        <w:rPr>
-          <w:rFonts w:ascii="Courier New" w:hAnsi="Courier New"/>
-        </w:rPr>
+        <w:rPr/>
         <w:t xml:space="preserve">              </w:t>
       </w:r>
       <w:r>
         <w:rPr>
-          <w:rFonts w:ascii="Courier New" w:hAnsi="Courier New"/>
           <w:sz w:val="21"/>
         </w:rPr>
         <w:t>className="input"</w:t>
@@ -2139,14 +1961,11 @@
         </w:rPr>
       </w:pPr>
       <w:r>
-        <w:rPr>
-          <w:rFonts w:ascii="Courier New" w:hAnsi="Courier New"/>
-        </w:rPr>
+        <w:rPr/>
         <w:t xml:space="preserve">              </w:t>
       </w:r>
       <w:r>
         <w:rPr>
-          <w:rFonts w:ascii="Courier New" w:hAnsi="Courier New"/>
           <w:sz w:val="21"/>
         </w:rPr>
         <w:t>type="text"</w:t>
@@ -2160,14 +1979,11 @@
         </w:rPr>
       </w:pPr>
       <w:r>
-        <w:rPr>
-          <w:rFonts w:ascii="Courier New" w:hAnsi="Courier New"/>
-        </w:rPr>
+        <w:rPr/>
         <w:t xml:space="preserve">              </w:t>
       </w:r>
       <w:r>
         <w:rPr>
-          <w:rFonts w:ascii="Courier New" w:hAnsi="Courier New"/>
           <w:sz w:val="21"/>
         </w:rPr>
         <w:t>value={modulus}</w:t>
@@ -2181,14 +1997,11 @@
         </w:rPr>
       </w:pPr>
       <w:r>
-        <w:rPr>
-          <w:rFonts w:ascii="Courier New" w:hAnsi="Courier New"/>
-        </w:rPr>
+        <w:rPr/>
         <w:t xml:space="preserve">              </w:t>
       </w:r>
       <w:r>
         <w:rPr>
-          <w:rFonts w:ascii="Courier New" w:hAnsi="Courier New"/>
           <w:sz w:val="21"/>
         </w:rPr>
         <w:t>onChange={(e) =&gt; setModulus(+e.target.value)}</w:t>
@@ -2202,14 +2015,11 @@
         </w:rPr>
       </w:pPr>
       <w:r>
-        <w:rPr>
-          <w:rFonts w:ascii="Courier New" w:hAnsi="Courier New"/>
-        </w:rPr>
+        <w:rPr/>
         <w:t xml:space="preserve">            </w:t>
       </w:r>
       <w:r>
         <w:rPr>
-          <w:rFonts w:ascii="Courier New" w:hAnsi="Courier New"/>
           <w:sz w:val="21"/>
         </w:rPr>
         <w:t>/&gt;</w:t>
@@ -2223,14 +2033,11 @@
         </w:rPr>
       </w:pPr>
       <w:r>
-        <w:rPr>
-          <w:rFonts w:ascii="Courier New" w:hAnsi="Courier New"/>
-        </w:rPr>
+        <w:rPr/>
         <w:t xml:space="preserve">          </w:t>
       </w:r>
       <w:r>
         <w:rPr>
-          <w:rFonts w:ascii="Courier New" w:hAnsi="Courier New"/>
           <w:sz w:val="21"/>
         </w:rPr>
         <w:t>&lt;/div&gt;</w:t>
@@ -2244,27 +2051,22 @@
         </w:rPr>
       </w:pPr>
       <w:r>
-        <w:rPr>
-          <w:rFonts w:ascii="Courier New" w:hAnsi="Courier New"/>
-        </w:rPr>
-      </w:r>
-    </w:p>
-    <w:p>
-      <w:pPr>
-        <w:pStyle w:val="Code"/>
-        <w:rPr>
-          <w:rFonts w:ascii="Courier New" w:hAnsi="Courier New"/>
-        </w:rPr>
-      </w:pPr>
-      <w:r>
-        <w:rPr>
-          <w:rFonts w:ascii="Courier New" w:hAnsi="Courier New"/>
-        </w:rPr>
+        <w:rPr/>
+      </w:r>
+    </w:p>
+    <w:p>
+      <w:pPr>
+        <w:pStyle w:val="Code"/>
+        <w:rPr>
+          <w:rFonts w:ascii="Courier New" w:hAnsi="Courier New"/>
+        </w:rPr>
+      </w:pPr>
+      <w:r>
+        <w:rPr/>
         <w:t xml:space="preserve">          </w:t>
       </w:r>
       <w:r>
         <w:rPr>
-          <w:rFonts w:ascii="Courier New" w:hAnsi="Courier New"/>
           <w:sz w:val="21"/>
         </w:rPr>
         <w:t>&lt;button className="btn"&gt;Submit&lt;/button&gt;</w:t>
@@ -2278,14 +2080,11 @@
         </w:rPr>
       </w:pPr>
       <w:r>
-        <w:rPr>
-          <w:rFonts w:ascii="Courier New" w:hAnsi="Courier New"/>
-        </w:rPr>
+        <w:rPr/>
         <w:t xml:space="preserve">        </w:t>
       </w:r>
       <w:r>
         <w:rPr>
-          <w:rFonts w:ascii="Courier New" w:hAnsi="Courier New"/>
           <w:sz w:val="21"/>
         </w:rPr>
         <w:t>&lt;/form&gt;</w:t>
@@ -2299,14 +2098,11 @@
         </w:rPr>
       </w:pPr>
       <w:r>
-        <w:rPr>
-          <w:rFonts w:ascii="Courier New" w:hAnsi="Courier New"/>
-        </w:rPr>
+        <w:rPr/>
         <w:t xml:space="preserve">      </w:t>
       </w:r>
       <w:r>
         <w:rPr>
-          <w:rFonts w:ascii="Courier New" w:hAnsi="Courier New"/>
           <w:sz w:val="21"/>
         </w:rPr>
         <w:t>&lt;/section&gt;</w:t>
@@ -2320,27 +2116,22 @@
         </w:rPr>
       </w:pPr>
       <w:r>
-        <w:rPr>
-          <w:rFonts w:ascii="Courier New" w:hAnsi="Courier New"/>
-        </w:rPr>
-      </w:r>
-    </w:p>
-    <w:p>
-      <w:pPr>
-        <w:pStyle w:val="Code"/>
-        <w:rPr>
-          <w:rFonts w:ascii="Courier New" w:hAnsi="Courier New"/>
-        </w:rPr>
-      </w:pPr>
-      <w:r>
-        <w:rPr>
-          <w:rFonts w:ascii="Courier New" w:hAnsi="Courier New"/>
-        </w:rPr>
+        <w:rPr/>
+      </w:r>
+    </w:p>
+    <w:p>
+      <w:pPr>
+        <w:pStyle w:val="Code"/>
+        <w:rPr>
+          <w:rFonts w:ascii="Courier New" w:hAnsi="Courier New"/>
+        </w:rPr>
+      </w:pPr>
+      <w:r>
+        <w:rPr/>
         <w:t xml:space="preserve">      </w:t>
       </w:r>
       <w:r>
         <w:rPr>
-          <w:rFonts w:ascii="Courier New" w:hAnsi="Courier New"/>
           <w:sz w:val="21"/>
         </w:rPr>
         <w:t>&lt;section className="bg-white rounded-md p-3 flex flex-col w-64"&gt;</w:t>
@@ -2354,14 +2145,11 @@
         </w:rPr>
       </w:pPr>
       <w:r>
-        <w:rPr>
-          <w:rFonts w:ascii="Courier New" w:hAnsi="Courier New"/>
-        </w:rPr>
+        <w:rPr/>
         <w:t xml:space="preserve">        </w:t>
       </w:r>
       <w:r>
         <w:rPr>
-          <w:rFonts w:ascii="Courier New" w:hAnsi="Courier New"/>
           <w:sz w:val="21"/>
         </w:rPr>
         <w:t>&lt;div className="flex flex-col gap-1"&gt;</w:t>
@@ -2375,14 +2163,11 @@
         </w:rPr>
       </w:pPr>
       <w:r>
-        <w:rPr>
-          <w:rFonts w:ascii="Courier New" w:hAnsi="Courier New"/>
-        </w:rPr>
+        <w:rPr/>
         <w:t xml:space="preserve">          </w:t>
       </w:r>
       <w:r>
         <w:rPr>
-          <w:rFonts w:ascii="Courier New" w:hAnsi="Courier New"/>
           <w:sz w:val="21"/>
         </w:rPr>
         <w:t>&lt;label htmlFor="output" className="label"&gt;</w:t>
@@ -2396,14 +2181,11 @@
         </w:rPr>
       </w:pPr>
       <w:r>
-        <w:rPr>
-          <w:rFonts w:ascii="Courier New" w:hAnsi="Courier New"/>
-        </w:rPr>
+        <w:rPr/>
         <w:t xml:space="preserve">            </w:t>
       </w:r>
       <w:r>
         <w:rPr>
-          <w:rFonts w:ascii="Courier New" w:hAnsi="Courier New"/>
           <w:sz w:val="21"/>
         </w:rPr>
         <w:t>Result</w:t>
@@ -2417,14 +2199,11 @@
         </w:rPr>
       </w:pPr>
       <w:r>
-        <w:rPr>
-          <w:rFonts w:ascii="Courier New" w:hAnsi="Courier New"/>
-        </w:rPr>
+        <w:rPr/>
         <w:t xml:space="preserve">          </w:t>
       </w:r>
       <w:r>
         <w:rPr>
-          <w:rFonts w:ascii="Courier New" w:hAnsi="Courier New"/>
           <w:sz w:val="21"/>
         </w:rPr>
         <w:t>&lt;/label&gt;</w:t>
@@ -2438,14 +2217,11 @@
         </w:rPr>
       </w:pPr>
       <w:r>
-        <w:rPr>
-          <w:rFonts w:ascii="Courier New" w:hAnsi="Courier New"/>
-        </w:rPr>
+        <w:rPr/>
         <w:t xml:space="preserve">          </w:t>
       </w:r>
       <w:r>
         <w:rPr>
-          <w:rFonts w:ascii="Courier New" w:hAnsi="Courier New"/>
           <w:sz w:val="21"/>
         </w:rPr>
         <w:t>&lt;textarea</w:t>
@@ -2459,14 +2235,11 @@
         </w:rPr>
       </w:pPr>
       <w:r>
-        <w:rPr>
-          <w:rFonts w:ascii="Courier New" w:hAnsi="Courier New"/>
-        </w:rPr>
+        <w:rPr/>
         <w:t xml:space="preserve">            </w:t>
       </w:r>
       <w:r>
         <w:rPr>
-          <w:rFonts w:ascii="Courier New" w:hAnsi="Courier New"/>
           <w:sz w:val="21"/>
         </w:rPr>
         <w:t>name="output"</w:t>
@@ -2480,14 +2253,11 @@
         </w:rPr>
       </w:pPr>
       <w:r>
-        <w:rPr>
-          <w:rFonts w:ascii="Courier New" w:hAnsi="Courier New"/>
-        </w:rPr>
+        <w:rPr/>
         <w:t xml:space="preserve">            </w:t>
       </w:r>
       <w:r>
         <w:rPr>
-          <w:rFonts w:ascii="Courier New" w:hAnsi="Courier New"/>
           <w:sz w:val="21"/>
         </w:rPr>
         <w:t>id="output"</w:t>
@@ -2501,14 +2271,11 @@
         </w:rPr>
       </w:pPr>
       <w:r>
-        <w:rPr>
-          <w:rFonts w:ascii="Courier New" w:hAnsi="Courier New"/>
-        </w:rPr>
+        <w:rPr/>
         <w:t xml:space="preserve">            </w:t>
       </w:r>
       <w:r>
         <w:rPr>
-          <w:rFonts w:ascii="Courier New" w:hAnsi="Courier New"/>
           <w:sz w:val="21"/>
         </w:rPr>
         <w:t>value={result}</w:t>
@@ -2522,14 +2289,11 @@
         </w:rPr>
       </w:pPr>
       <w:r>
-        <w:rPr>
-          <w:rFonts w:ascii="Courier New" w:hAnsi="Courier New"/>
-        </w:rPr>
+        <w:rPr/>
         <w:t xml:space="preserve">            </w:t>
       </w:r>
       <w:r>
         <w:rPr>
-          <w:rFonts w:ascii="Courier New" w:hAnsi="Courier New"/>
           <w:sz w:val="21"/>
         </w:rPr>
         <w:t>readOnly</w:t>
@@ -2543,14 +2307,11 @@
         </w:rPr>
       </w:pPr>
       <w:r>
-        <w:rPr>
-          <w:rFonts w:ascii="Courier New" w:hAnsi="Courier New"/>
-        </w:rPr>
+        <w:rPr/>
         <w:t xml:space="preserve">            </w:t>
       </w:r>
       <w:r>
         <w:rPr>
-          <w:rFonts w:ascii="Courier New" w:hAnsi="Courier New"/>
           <w:sz w:val="21"/>
         </w:rPr>
         <w:t>className="textarea resize-none"</w:t>
@@ -2564,14 +2325,11 @@
         </w:rPr>
       </w:pPr>
       <w:r>
-        <w:rPr>
-          <w:rFonts w:ascii="Courier New" w:hAnsi="Courier New"/>
-        </w:rPr>
+        <w:rPr/>
         <w:t xml:space="preserve">          </w:t>
       </w:r>
       <w:r>
         <w:rPr>
-          <w:rFonts w:ascii="Courier New" w:hAnsi="Courier New"/>
           <w:sz w:val="21"/>
         </w:rPr>
         <w:t>&gt;&lt;/textarea&gt;</w:t>
@@ -2585,14 +2343,11 @@
         </w:rPr>
       </w:pPr>
       <w:r>
-        <w:rPr>
-          <w:rFonts w:ascii="Courier New" w:hAnsi="Courier New"/>
-        </w:rPr>
+        <w:rPr/>
         <w:t xml:space="preserve">        </w:t>
       </w:r>
       <w:r>
         <w:rPr>
-          <w:rFonts w:ascii="Courier New" w:hAnsi="Courier New"/>
           <w:sz w:val="21"/>
         </w:rPr>
         <w:t>&lt;/div&gt;</w:t>
@@ -2606,14 +2361,11 @@
         </w:rPr>
       </w:pPr>
       <w:r>
-        <w:rPr>
-          <w:rFonts w:ascii="Courier New" w:hAnsi="Courier New"/>
-        </w:rPr>
+        <w:rPr/>
         <w:t xml:space="preserve">      </w:t>
       </w:r>
       <w:r>
         <w:rPr>
-          <w:rFonts w:ascii="Courier New" w:hAnsi="Courier New"/>
           <w:sz w:val="21"/>
         </w:rPr>
         <w:t>&lt;/section&gt;</w:t>
@@ -2627,14 +2379,11 @@
         </w:rPr>
       </w:pPr>
       <w:r>
-        <w:rPr>
-          <w:rFonts w:ascii="Courier New" w:hAnsi="Courier New"/>
-        </w:rPr>
+        <w:rPr/>
         <w:t xml:space="preserve">    </w:t>
       </w:r>
       <w:r>
         <w:rPr>
-          <w:rFonts w:ascii="Courier New" w:hAnsi="Courier New"/>
           <w:sz w:val="21"/>
         </w:rPr>
         <w:t>&lt;/div&gt;</w:t>
@@ -2648,14 +2397,11 @@
         </w:rPr>
       </w:pPr>
       <w:r>
-        <w:rPr>
-          <w:rFonts w:ascii="Courier New" w:hAnsi="Courier New"/>
-        </w:rPr>
+        <w:rPr/>
         <w:t xml:space="preserve">  </w:t>
       </w:r>
       <w:r>
         <w:rPr>
-          <w:rFonts w:ascii="Courier New" w:hAnsi="Courier New"/>
           <w:sz w:val="21"/>
         </w:rPr>
         <w:t>);</w:t>
@@ -2669,9 +2415,7 @@
         </w:rPr>
       </w:pPr>
       <w:r>
-        <w:rPr>
-          <w:rFonts w:ascii="Courier New" w:hAnsi="Courier New"/>
-        </w:rPr>
+        <w:rPr/>
         <w:t>}</w:t>
       </w:r>
     </w:p>
@@ -2719,11 +2463,7 @@
       </w:pPr>
       <w:r>
         <w:rPr/>
-        <w:t xml:space="preserve">3 </w:t>
-      </w:r>
-      <w:r>
-        <w:rPr/>
-        <w:t>Результати роботи</w:t>
+        <w:t>3 Результати роботи</w:t>
       </w:r>
     </w:p>
     <w:p>
@@ -2947,6 +2687,430 @@
     </w:p>
     <w:p>
       <w:pPr>
+        <w:pStyle w:val="P1"/>
+        <w:rPr/>
+      </w:pPr>
+      <w:r>
+        <w:rPr/>
+      </w:r>
+    </w:p>
+    <w:p>
+      <w:pPr>
+        <w:pStyle w:val="P1"/>
+        <w:rPr/>
+      </w:pPr>
+      <w:r>
+        <w:rPr/>
+        <w:t>Відомі методи побудови паралельних алгоритмів:</w:t>
+      </w:r>
+    </w:p>
+    <w:p>
+      <w:pPr>
+        <w:pStyle w:val="P1"/>
+        <w:rPr/>
+      </w:pPr>
+      <w:r>
+        <w:rPr/>
+        <w:t>- конвеєрна обробка: процес розбивається на послідовні етапи;</w:t>
+      </w:r>
+    </w:p>
+    <w:p>
+      <w:pPr>
+        <w:pStyle w:val="P1"/>
+        <w:rPr/>
+      </w:pPr>
+      <w:r>
+        <w:rPr/>
+        <w:t>- розділяй та володарюй: задача рекурсивно розділяється на підзадачі, поки вони не стануть достатньо малими для вирішення.</w:t>
+      </w:r>
+    </w:p>
+    <w:p>
+      <w:pPr>
+        <w:pStyle w:val="P1"/>
+        <w:rPr/>
+      </w:pPr>
+      <w:r>
+        <w:rPr/>
+        <w:t>Різниця між послідовною та паралельною моделями програмування наведено на таблиці нижче:</w:t>
+      </w:r>
+    </w:p>
+    <w:p>
+      <w:pPr>
+        <w:pStyle w:val="P1"/>
+        <w:rPr/>
+      </w:pPr>
+      <w:r>
+        <w:rPr/>
+      </w:r>
+    </w:p>
+    <w:p>
+      <w:pPr>
+        <w:pStyle w:val="P1"/>
+        <w:rPr/>
+      </w:pPr>
+      <w:r>
+        <w:rPr/>
+        <w:t>Таблиця 1.1 — Порівняння двох моделей</w:t>
+      </w:r>
+    </w:p>
+    <w:tbl>
+      <w:tblPr>
+        <w:tblW w:w="5000" w:type="pct"/>
+        <w:jc w:val="left"/>
+        <w:tblInd w:w="55" w:type="dxa"/>
+        <w:tblLayout w:type="fixed"/>
+        <w:tblCellMar>
+          <w:top w:w="55" w:type="dxa"/>
+          <w:left w:w="55" w:type="dxa"/>
+          <w:bottom w:w="55" w:type="dxa"/>
+          <w:right w:w="55" w:type="dxa"/>
+        </w:tblCellMar>
+      </w:tblPr>
+      <w:tblGrid>
+        <w:gridCol w:w="2232"/>
+        <w:gridCol w:w="3785"/>
+        <w:gridCol w:w="3009"/>
+      </w:tblGrid>
+      <w:tr>
+        <w:trPr/>
+        <w:tc>
+          <w:tcPr>
+            <w:tcW w:w="2232" w:type="dxa"/>
+            <w:tcBorders>
+              <w:top w:val="single" w:sz="4" w:space="0" w:color="000000"/>
+              <w:left w:val="single" w:sz="4" w:space="0" w:color="000000"/>
+              <w:bottom w:val="single" w:sz="4" w:space="0" w:color="000000"/>
+            </w:tcBorders>
+          </w:tcPr>
+          <w:p>
+            <w:pPr>
+              <w:pStyle w:val="user3"/>
+              <w:spacing w:lineRule="auto" w:line="240"/>
+              <w:ind w:hanging="0" w:left="0"/>
+              <w:rPr>
+                <w:b/>
+                <w:bCs/>
+                <w:lang w:val="uk-UA"/>
+              </w:rPr>
+            </w:pPr>
+            <w:r>
+              <w:rPr>
+                <w:b/>
+                <w:bCs/>
+                <w:lang w:val="uk-UA"/>
+              </w:rPr>
+              <w:t>Характеристика</w:t>
+            </w:r>
+          </w:p>
+        </w:tc>
+        <w:tc>
+          <w:tcPr>
+            <w:tcW w:w="3785" w:type="dxa"/>
+            <w:tcBorders>
+              <w:top w:val="single" w:sz="4" w:space="0" w:color="000000"/>
+              <w:left w:val="single" w:sz="4" w:space="0" w:color="000000"/>
+              <w:bottom w:val="single" w:sz="4" w:space="0" w:color="000000"/>
+            </w:tcBorders>
+          </w:tcPr>
+          <w:p>
+            <w:pPr>
+              <w:pStyle w:val="user3"/>
+              <w:spacing w:lineRule="auto" w:line="240"/>
+              <w:ind w:hanging="0" w:left="0"/>
+              <w:rPr>
+                <w:b/>
+                <w:bCs/>
+              </w:rPr>
+            </w:pPr>
+            <w:r>
+              <w:rPr>
+                <w:b/>
+                <w:bCs/>
+              </w:rPr>
+              <w:t>Послідовна модель</w:t>
+            </w:r>
+          </w:p>
+        </w:tc>
+        <w:tc>
+          <w:tcPr>
+            <w:tcW w:w="3009" w:type="dxa"/>
+            <w:tcBorders>
+              <w:top w:val="single" w:sz="4" w:space="0" w:color="000000"/>
+              <w:left w:val="single" w:sz="4" w:space="0" w:color="000000"/>
+              <w:bottom w:val="single" w:sz="4" w:space="0" w:color="000000"/>
+              <w:right w:val="single" w:sz="4" w:space="0" w:color="000000"/>
+            </w:tcBorders>
+          </w:tcPr>
+          <w:p>
+            <w:pPr>
+              <w:pStyle w:val="user3"/>
+              <w:spacing w:lineRule="auto" w:line="240"/>
+              <w:ind w:hanging="0" w:left="0"/>
+              <w:rPr>
+                <w:b/>
+                <w:bCs/>
+              </w:rPr>
+            </w:pPr>
+            <w:r>
+              <w:rPr>
+                <w:b/>
+                <w:bCs/>
+              </w:rPr>
+              <w:t>Паралельна модель</w:t>
+            </w:r>
+          </w:p>
+        </w:tc>
+      </w:tr>
+      <w:tr>
+        <w:trPr/>
+        <w:tc>
+          <w:tcPr>
+            <w:tcW w:w="2232" w:type="dxa"/>
+            <w:tcBorders>
+              <w:left w:val="single" w:sz="4" w:space="0" w:color="000000"/>
+              <w:bottom w:val="single" w:sz="4" w:space="0" w:color="000000"/>
+            </w:tcBorders>
+          </w:tcPr>
+          <w:p>
+            <w:pPr>
+              <w:pStyle w:val="user3"/>
+              <w:spacing w:lineRule="auto" w:line="240"/>
+              <w:ind w:hanging="0" w:left="0"/>
+              <w:rPr>
+                <w:lang w:val="uk-UA"/>
+              </w:rPr>
+            </w:pPr>
+            <w:r>
+              <w:rPr>
+                <w:lang w:val="uk-UA"/>
+              </w:rPr>
+              <w:t>Виконання</w:t>
+            </w:r>
+          </w:p>
+        </w:tc>
+        <w:tc>
+          <w:tcPr>
+            <w:tcW w:w="3785" w:type="dxa"/>
+            <w:tcBorders>
+              <w:left w:val="single" w:sz="4" w:space="0" w:color="000000"/>
+              <w:bottom w:val="single" w:sz="4" w:space="0" w:color="000000"/>
+            </w:tcBorders>
+          </w:tcPr>
+          <w:p>
+            <w:pPr>
+              <w:pStyle w:val="user3"/>
+              <w:spacing w:lineRule="auto" w:line="240"/>
+              <w:ind w:hanging="0" w:left="0"/>
+              <w:rPr/>
+            </w:pPr>
+            <w:r>
+              <w:rPr/>
+              <w:t>Одна операція за одиницю часу</w:t>
+            </w:r>
+          </w:p>
+        </w:tc>
+        <w:tc>
+          <w:tcPr>
+            <w:tcW w:w="3009" w:type="dxa"/>
+            <w:tcBorders>
+              <w:left w:val="single" w:sz="4" w:space="0" w:color="000000"/>
+              <w:bottom w:val="single" w:sz="4" w:space="0" w:color="000000"/>
+              <w:right w:val="single" w:sz="4" w:space="0" w:color="000000"/>
+            </w:tcBorders>
+          </w:tcPr>
+          <w:p>
+            <w:pPr>
+              <w:pStyle w:val="user3"/>
+              <w:spacing w:lineRule="auto" w:line="240"/>
+              <w:ind w:hanging="0" w:left="0"/>
+              <w:rPr/>
+            </w:pPr>
+            <w:r>
+              <w:rPr/>
+              <w:t>Багато операцій одночасно</w:t>
+            </w:r>
+          </w:p>
+        </w:tc>
+      </w:tr>
+      <w:tr>
+        <w:trPr/>
+        <w:tc>
+          <w:tcPr>
+            <w:tcW w:w="2232" w:type="dxa"/>
+            <w:tcBorders>
+              <w:left w:val="single" w:sz="4" w:space="0" w:color="000000"/>
+              <w:bottom w:val="single" w:sz="4" w:space="0" w:color="000000"/>
+            </w:tcBorders>
+          </w:tcPr>
+          <w:p>
+            <w:pPr>
+              <w:pStyle w:val="user3"/>
+              <w:spacing w:lineRule="auto" w:line="240"/>
+              <w:ind w:hanging="0" w:left="0"/>
+              <w:rPr>
+                <w:lang w:val="uk-UA"/>
+              </w:rPr>
+            </w:pPr>
+            <w:r>
+              <w:rPr>
+                <w:lang w:val="uk-UA"/>
+              </w:rPr>
+              <w:t>Детермінізм</w:t>
+            </w:r>
+          </w:p>
+        </w:tc>
+        <w:tc>
+          <w:tcPr>
+            <w:tcW w:w="3785" w:type="dxa"/>
+            <w:tcBorders>
+              <w:left w:val="single" w:sz="4" w:space="0" w:color="000000"/>
+              <w:bottom w:val="single" w:sz="4" w:space="0" w:color="000000"/>
+            </w:tcBorders>
+          </w:tcPr>
+          <w:p>
+            <w:pPr>
+              <w:pStyle w:val="user3"/>
+              <w:spacing w:lineRule="auto" w:line="240"/>
+              <w:ind w:hanging="0" w:left="0"/>
+              <w:rPr/>
+            </w:pPr>
+            <w:r>
+              <w:rPr/>
+              <w:t>Результат завжди однаковий</w:t>
+            </w:r>
+          </w:p>
+        </w:tc>
+        <w:tc>
+          <w:tcPr>
+            <w:tcW w:w="3009" w:type="dxa"/>
+            <w:tcBorders>
+              <w:left w:val="single" w:sz="4" w:space="0" w:color="000000"/>
+              <w:bottom w:val="single" w:sz="4" w:space="0" w:color="000000"/>
+              <w:right w:val="single" w:sz="4" w:space="0" w:color="000000"/>
+            </w:tcBorders>
+          </w:tcPr>
+          <w:p>
+            <w:pPr>
+              <w:pStyle w:val="user3"/>
+              <w:spacing w:lineRule="auto" w:line="240"/>
+              <w:ind w:hanging="0" w:left="0"/>
+              <w:rPr/>
+            </w:pPr>
+            <w:r>
+              <w:rPr/>
+              <w:t>Можливий вплив «стану гонитви» (</w:t>
+            </w:r>
+            <w:r>
+              <w:rPr>
+                <w:i/>
+                <w:iCs/>
+                <w:lang w:val="en-US"/>
+              </w:rPr>
+              <w:t>race condition</w:t>
+            </w:r>
+            <w:r>
+              <w:rPr>
+                <w:i w:val="false"/>
+                <w:iCs w:val="false"/>
+                <w:lang w:val="en-US"/>
+              </w:rPr>
+              <w:t>)</w:t>
+            </w:r>
+          </w:p>
+        </w:tc>
+      </w:tr>
+      <w:tr>
+        <w:trPr/>
+        <w:tc>
+          <w:tcPr>
+            <w:tcW w:w="2232" w:type="dxa"/>
+            <w:tcBorders>
+              <w:left w:val="single" w:sz="4" w:space="0" w:color="000000"/>
+              <w:bottom w:val="single" w:sz="4" w:space="0" w:color="000000"/>
+            </w:tcBorders>
+          </w:tcPr>
+          <w:p>
+            <w:pPr>
+              <w:pStyle w:val="user3"/>
+              <w:spacing w:lineRule="auto" w:line="240"/>
+              <w:ind w:hanging="0" w:left="0"/>
+              <w:rPr>
+                <w:lang w:val="uk-UA"/>
+              </w:rPr>
+            </w:pPr>
+            <w:r>
+              <w:rPr>
+                <w:lang w:val="uk-UA"/>
+              </w:rPr>
+              <w:t>Складність</w:t>
+            </w:r>
+          </w:p>
+        </w:tc>
+        <w:tc>
+          <w:tcPr>
+            <w:tcW w:w="3785" w:type="dxa"/>
+            <w:tcBorders>
+              <w:left w:val="single" w:sz="4" w:space="0" w:color="000000"/>
+              <w:bottom w:val="single" w:sz="4" w:space="0" w:color="000000"/>
+            </w:tcBorders>
+          </w:tcPr>
+          <w:p>
+            <w:pPr>
+              <w:pStyle w:val="user3"/>
+              <w:spacing w:lineRule="auto" w:line="240"/>
+              <w:ind w:hanging="0" w:left="0"/>
+              <w:rPr/>
+            </w:pPr>
+            <w:r>
+              <w:rPr/>
+              <w:t>Проста для розуміння</w:t>
+            </w:r>
+          </w:p>
+        </w:tc>
+        <w:tc>
+          <w:tcPr>
+            <w:tcW w:w="3009" w:type="dxa"/>
+            <w:tcBorders>
+              <w:left w:val="single" w:sz="4" w:space="0" w:color="000000"/>
+              <w:bottom w:val="single" w:sz="4" w:space="0" w:color="000000"/>
+              <w:right w:val="single" w:sz="4" w:space="0" w:color="000000"/>
+            </w:tcBorders>
+          </w:tcPr>
+          <w:p>
+            <w:pPr>
+              <w:pStyle w:val="user3"/>
+              <w:spacing w:lineRule="auto" w:line="240"/>
+              <w:ind w:hanging="0" w:left="0"/>
+              <w:rPr/>
+            </w:pPr>
+            <w:r>
+              <w:rPr/>
+              <w:t>Висока складність</w:t>
+            </w:r>
+          </w:p>
+        </w:tc>
+      </w:tr>
+    </w:tbl>
+    <w:p>
+      <w:pPr>
+        <w:pStyle w:val="P1"/>
+        <w:rPr/>
+      </w:pPr>
+      <w:r>
+        <w:rPr/>
+      </w:r>
+    </w:p>
+    <w:p>
+      <w:pPr>
+        <w:pStyle w:val="P1"/>
+        <w:rPr/>
+      </w:pPr>
+      <w:r>
+        <w:rPr/>
+      </w:r>
+    </w:p>
+    <w:p>
+      <w:pPr>
         <w:pStyle w:val="H2"/>
         <w:rPr/>
       </w:pPr>
@@ -2957,12 +3121,191 @@
     </w:p>
     <w:p>
       <w:pPr>
+        <w:pStyle w:val="P1"/>
+        <w:rPr/>
+      </w:pPr>
+      <w:r>
+        <w:rPr/>
+      </w:r>
+    </w:p>
+    <w:p>
+      <w:pPr>
+        <w:pStyle w:val="P1"/>
+        <w:rPr/>
+      </w:pPr>
+      <w:r>
+        <w:rPr/>
+        <w:t>Парадигми паралельного програмування визначають спосіб, у який розробник структурує код для одночасного виконання.</w:t>
+      </w:r>
+    </w:p>
+    <w:p>
+      <w:pPr>
+        <w:pStyle w:val="P1"/>
+        <w:rPr/>
+      </w:pPr>
+      <w:r>
+        <w:rPr/>
+        <w:t>Паралелізм даних — підхід, при якому одна операція одночасно застосовується до різних елементів набору даних.</w:t>
+      </w:r>
+    </w:p>
+    <w:p>
+      <w:pPr>
+        <w:pStyle w:val="P1"/>
+        <w:rPr/>
+      </w:pPr>
+      <w:r>
+        <w:rPr/>
+        <w:t>Паралелізм задач — парадигма, де обчислювальні вузли (потоки / процеси) виконують різні завдання над одними даними.</w:t>
+      </w:r>
+    </w:p>
+    <w:p>
+      <w:pPr>
+        <w:pStyle w:val="P1"/>
+        <w:rPr/>
+      </w:pPr>
+      <w:r>
+        <w:rPr/>
+      </w:r>
+    </w:p>
+    <w:p>
+      <w:pPr>
         <w:pStyle w:val="H2"/>
         <w:rPr/>
       </w:pPr>
       <w:r>
         <w:rPr/>
         <w:t>Як побудувати граф алгоритму?</w:t>
+      </w:r>
+    </w:p>
+    <w:p>
+      <w:pPr>
+        <w:pStyle w:val="P1"/>
+        <w:rPr/>
+      </w:pPr>
+      <w:r>
+        <w:rPr/>
+      </w:r>
+    </w:p>
+    <w:p>
+      <w:pPr>
+        <w:pStyle w:val="P1"/>
+        <w:rPr/>
+      </w:pPr>
+      <w:r>
+        <w:rPr/>
+        <w:t xml:space="preserve">Для побудови графу алгоритму можна використати вебсайт </w:t>
+      </w:r>
+      <w:r>
+        <w:rPr>
+          <w:lang w:val="en-US"/>
+        </w:rPr>
+        <w:t xml:space="preserve">draw.io. </w:t>
+      </w:r>
+      <w:r>
+        <w:rPr>
+          <w:lang w:val="uk-UA"/>
+        </w:rPr>
+        <w:t>На ньому можна обрати фігури з набору «Блок-схема» та створити граф, перетягуючи елементи на дошку.</w:t>
+      </w:r>
+    </w:p>
+    <w:p>
+      <w:pPr>
+        <w:pStyle w:val="P1"/>
+        <w:rPr/>
+      </w:pPr>
+      <w:r>
+        <w:rPr/>
+      </w:r>
+    </w:p>
+    <w:p>
+      <w:pPr>
+        <w:pStyle w:val="H2"/>
+        <w:rPr/>
+      </w:pPr>
+      <w:r>
+        <w:rPr/>
+        <w:t>З яких кроків складається розробка паралельного алгоритму? В чому сутність кожного кроку</w:t>
+      </w:r>
+    </w:p>
+    <w:p>
+      <w:pPr>
+        <w:pStyle w:val="P1"/>
+        <w:rPr/>
+      </w:pPr>
+      <w:r>
+        <w:rPr/>
+      </w:r>
+    </w:p>
+    <w:p>
+      <w:pPr>
+        <w:pStyle w:val="P1"/>
+        <w:rPr/>
+      </w:pPr>
+      <w:r>
+        <w:rPr/>
+        <w:t>Розробка паралельного алгоритму складається з 4 етапів:</w:t>
+      </w:r>
+    </w:p>
+    <w:p>
+      <w:pPr>
+        <w:pStyle w:val="P1"/>
+        <w:rPr/>
+      </w:pPr>
+      <w:r>
+        <w:rPr/>
+        <w:t>- декомпозиція — поділ великої задачі на менші;</w:t>
+      </w:r>
+    </w:p>
+    <w:p>
+      <w:pPr>
+        <w:pStyle w:val="P1"/>
+        <w:rPr/>
+      </w:pPr>
+      <w:r>
+        <w:rPr/>
+        <w:t>- визначення залежностей — аналіз даних та процесів для виявлення того, які підзадачі потребують результатів інших;</w:t>
+      </w:r>
+    </w:p>
+    <w:p>
+      <w:pPr>
+        <w:pStyle w:val="P1"/>
+        <w:rPr/>
+      </w:pPr>
+      <w:r>
+        <w:rPr/>
+        <w:t>- масштабування — визначення оптимальної кількості пізадач та їх розміру;</w:t>
+      </w:r>
+    </w:p>
+    <w:p>
+      <w:pPr>
+        <w:pStyle w:val="P1"/>
+        <w:rPr/>
+      </w:pPr>
+      <w:r>
+        <w:rPr/>
+        <w:t>- розподіл підзадач — призначення конкретних підзадач на конкретні процесори / ядра.</w:t>
+      </w:r>
+    </w:p>
+    <w:p>
+      <w:pPr>
+        <w:pStyle w:val="P1"/>
+        <w:rPr/>
+      </w:pPr>
+      <w:r>
+        <w:rPr/>
+        <w:t xml:space="preserve">Джерело: </w:t>
+      </w:r>
+      <w:hyperlink r:id="rId5">
+        <w:r>
+          <w:rPr>
+            <w:rStyle w:val="Hyperlink"/>
+          </w:rPr>
+          <w:t>https://uk.wikipedia.org/wiki/Принципи_розробки_паралельних_методів</w:t>
+        </w:r>
+      </w:hyperlink>
+      <w:r>
+        <w:rPr/>
+        <w:t>.</w:t>
       </w:r>
     </w:p>
     <w:sectPr>
@@ -3763,12 +4106,12 @@
       <w:lang w:val="en-US" w:eastAsia="uk-UA"/>
     </w:rPr>
   </w:style>
-  <w:style w:type="character" w:styleId="Style12">
-    <w:name w:val="Символ нумерації"/>
+  <w:style w:type="character" w:styleId="user">
+    <w:name w:val="Символ нумерації (user)"/>
     <w:qFormat/>
     <w:rPr/>
   </w:style>
-  <w:style w:type="paragraph" w:styleId="Style13">
+  <w:style w:type="paragraph" w:styleId="Style12">
     <w:name w:val="Заголовок"/>
     <w:basedOn w:val="Normal"/>
     <w:next w:val="BodyText"/>
@@ -3778,7 +4121,7 @@
       <w:spacing w:before="240" w:after="120"/>
     </w:pPr>
     <w:rPr>
-      <w:rFonts w:ascii="Liberation Sans" w:hAnsi="Liberation Sans" w:eastAsia="Microsoft YaHei" w:cs="Lucida Sans"/>
+      <w:rFonts w:ascii="Liberation Sans" w:hAnsi="Liberation Sans" w:eastAsia="Microsoft YaHei" w:cs="Arial Unicode MS"/>
       <w:sz w:val="28"/>
       <w:szCs w:val="28"/>
     </w:rPr>
@@ -3815,8 +4158,34 @@
       <w:szCs w:val="24"/>
     </w:rPr>
   </w:style>
-  <w:style w:type="paragraph" w:styleId="Style14">
+  <w:style w:type="paragraph" w:styleId="Style13">
     <w:name w:val="Покажчик"/>
+    <w:basedOn w:val="Normal"/>
+    <w:qFormat/>
+    <w:pPr>
+      <w:suppressLineNumbers/>
+    </w:pPr>
+    <w:rPr>
+      <w:rFonts w:cs="Arial Unicode MS"/>
+    </w:rPr>
+  </w:style>
+  <w:style w:type="paragraph" w:styleId="user1">
+    <w:name w:val="Заголовок (user)"/>
+    <w:basedOn w:val="Normal"/>
+    <w:next w:val="BodyText"/>
+    <w:qFormat/>
+    <w:pPr>
+      <w:keepNext w:val="true"/>
+      <w:spacing w:before="240" w:after="120"/>
+    </w:pPr>
+    <w:rPr>
+      <w:rFonts w:ascii="Liberation Sans" w:hAnsi="Liberation Sans" w:eastAsia="Microsoft YaHei" w:cs="Lucida Sans"/>
+      <w:sz w:val="28"/>
+      <w:szCs w:val="28"/>
+    </w:rPr>
+  </w:style>
+  <w:style w:type="paragraph" w:styleId="user2">
+    <w:name w:val="Покажчик (user)"/>
     <w:basedOn w:val="Normal"/>
     <w:qFormat/>
     <w:pPr>
@@ -3826,35 +4195,9 @@
       <w:rFonts w:cs="Lucida Sans"/>
     </w:rPr>
   </w:style>
-  <w:style w:type="paragraph" w:styleId="user">
-    <w:name w:val="Заголовок (user)"/>
-    <w:basedOn w:val="Normal"/>
-    <w:next w:val="BodyText"/>
-    <w:qFormat/>
-    <w:pPr>
-      <w:keepNext w:val="true"/>
-      <w:spacing w:before="240" w:after="120"/>
-    </w:pPr>
-    <w:rPr>
-      <w:rFonts w:ascii="Liberation Sans" w:hAnsi="Liberation Sans" w:eastAsia="Microsoft YaHei" w:cs="Arial Unicode MS"/>
-      <w:sz w:val="28"/>
-      <w:szCs w:val="28"/>
-    </w:rPr>
-  </w:style>
-  <w:style w:type="paragraph" w:styleId="user1">
-    <w:name w:val="Покажчик (user)"/>
-    <w:basedOn w:val="Normal"/>
-    <w:qFormat/>
-    <w:pPr>
-      <w:suppressLineNumbers/>
-    </w:pPr>
-    <w:rPr>
-      <w:rFonts w:cs="Arial Unicode MS"/>
-    </w:rPr>
-  </w:style>
   <w:style w:type="paragraph" w:styleId="IndexHeading">
     <w:name w:val="index heading"/>
-    <w:basedOn w:val="user"/>
+    <w:basedOn w:val="Style12"/>
     <w:pPr/>
     <w:rPr/>
   </w:style>
@@ -4132,8 +4475,8 @@
     </w:pPr>
     <w:rPr/>
   </w:style>
-  <w:style w:type="paragraph" w:styleId="user2">
-    <w:name w:val="Вміст таблиці (user)"/>
+  <w:style w:type="paragraph" w:styleId="Style14">
+    <w:name w:val="Вміст таблиці"/>
     <w:basedOn w:val="Normal"/>
     <w:qFormat/>
     <w:pPr>
@@ -4142,8 +4485,18 @@
     </w:pPr>
     <w:rPr/>
   </w:style>
-  <w:style w:type="numbering" w:styleId="user3" w:default="1">
-    <w:name w:val="Без маркерів (user)"/>
+  <w:style w:type="paragraph" w:styleId="user3">
+    <w:name w:val="Вміст таблиці (user)"/>
+    <w:basedOn w:val="Normal"/>
+    <w:qFormat/>
+    <w:pPr>
+      <w:widowControl w:val="false"/>
+      <w:suppressLineNumbers/>
+    </w:pPr>
+    <w:rPr/>
+  </w:style>
+  <w:style w:type="numbering" w:styleId="Style15" w:default="1">
+    <w:name w:val="Без маркерів"/>
     <w:uiPriority w:val="99"/>
     <w:semiHidden/>
     <w:unhideWhenUsed/>

</xml_diff>

<commit_message>
feat (TR2): fix the algorithms, add correct block schemas
</commit_message>
<xml_diff>
--- a/42TR Tehnologiji Rozpodilenyh System/2/TR_KNT-122_Onyshchenko_19_PR2.docx
+++ b/42TR Tehnologiji Rozpodilenyh System/2/TR_KNT-122_Onyshchenko_19_PR2.docx
@@ -545,68 +545,11 @@
       </w:pPr>
       <w:r>
         <w:rPr/>
-      </w:r>
-    </w:p>
-    <w:p>
-      <w:pPr>
-        <w:pStyle w:val="img1"/>
-        <w:rPr/>
-      </w:pPr>
-      <w:r>
-        <w:rPr/>
-        <w:t xml:space="preserve">Рисунок 1.1 — Блок-схема </w:t>
-      </w:r>
-      <w:r>
-        <w:rPr/>
-        <w:t xml:space="preserve">бінарного </w:t>
-      </w:r>
-      <w:r>
-        <w:rPr/>
-        <w:t>алгоритму</w:t>
-      </w:r>
-    </w:p>
-    <w:p>
-      <w:pPr>
-        <w:pStyle w:val="P1"/>
-        <w:rPr/>
-      </w:pPr>
-      <w:r>
-        <w:rPr/>
-      </w:r>
-    </w:p>
-    <w:p>
-      <w:pPr>
-        <w:pStyle w:val="H3"/>
-        <w:rPr/>
-      </w:pPr>
-      <w:bookmarkStart w:id="0" w:name="__RefHeading___Toc1130_792013498"/>
-      <w:bookmarkEnd w:id="0"/>
-      <w:r>
-        <w:rPr/>
-        <w:t>Двухпоточний Монтгомері</w:t>
-      </w:r>
-    </w:p>
-    <w:p>
-      <w:pPr>
-        <w:pStyle w:val="P1"/>
-        <w:rPr/>
-      </w:pPr>
-      <w:r>
-        <w:rPr/>
-      </w:r>
-    </w:p>
-    <w:p>
-      <w:pPr>
-        <w:pStyle w:val="img1"/>
-        <w:rPr/>
-      </w:pPr>
-      <w:r>
-        <w:rPr/>
         <w:drawing>
           <wp:inline distT="0" distB="0" distL="0" distR="0">
-            <wp:extent cx="3933825" cy="5743575"/>
+            <wp:extent cx="4410075" cy="5848350"/>
             <wp:effectExtent l="0" t="0" r="0" b="0"/>
-            <wp:docPr id="1" name="Зображення3"/>
+            <wp:docPr id="1" name="Зображення1"/>
             <wp:cNvGraphicFramePr>
               <a:graphicFrameLocks xmlns:a="http://schemas.openxmlformats.org/drawingml/2006/main" noChangeAspect="1"/>
             </wp:cNvGraphicFramePr>
@@ -614,7 +557,7 @@
               <a:graphicData uri="http://schemas.openxmlformats.org/drawingml/2006/picture">
                 <pic:pic xmlns:pic="http://schemas.openxmlformats.org/drawingml/2006/picture">
                   <pic:nvPicPr>
-                    <pic:cNvPr id="1" name="Зображення3"/>
+                    <pic:cNvPr id="1" name="Зображення1"/>
                     <pic:cNvPicPr>
                       <a:picLocks noChangeAspect="1" noChangeArrowheads="1"/>
                     </pic:cNvPicPr>
@@ -624,6 +567,107 @@
                       <a:extLst>
                         <a:ext uri="{96DAC541-7B7A-43D3-8B79-37D633B846F1}">
                           <asvg:svgBlip xmlns:asvg="http://schemas.microsoft.com/office/drawing/2016/SVG/main" r:embed="rId3"/>
+                        </a:ext>
+                      </a:extLst>
+                    </a:blip>
+                    <a:stretch>
+                      <a:fillRect/>
+                    </a:stretch>
+                  </pic:blipFill>
+                  <pic:spPr bwMode="auto">
+                    <a:xfrm>
+                      <a:off x="0" y="0"/>
+                      <a:ext cx="4410075" cy="5848350"/>
+                    </a:xfrm>
+                    <a:prstGeom prst="rect">
+                      <a:avLst/>
+                    </a:prstGeom>
+                    <a:noFill/>
+                  </pic:spPr>
+                </pic:pic>
+              </a:graphicData>
+            </a:graphic>
+          </wp:inline>
+        </w:drawing>
+      </w:r>
+    </w:p>
+    <w:p>
+      <w:pPr>
+        <w:pStyle w:val="img1"/>
+        <w:rPr/>
+      </w:pPr>
+      <w:r>
+        <w:rPr/>
+        <w:t xml:space="preserve">Рисунок 1.1 — Блок-схема </w:t>
+      </w:r>
+      <w:r>
+        <w:rPr/>
+        <w:t xml:space="preserve">бінарного </w:t>
+      </w:r>
+      <w:r>
+        <w:rPr/>
+        <w:t>алгоритму</w:t>
+      </w:r>
+    </w:p>
+    <w:p>
+      <w:pPr>
+        <w:pStyle w:val="P1"/>
+        <w:rPr/>
+      </w:pPr>
+      <w:r>
+        <w:rPr/>
+      </w:r>
+    </w:p>
+    <w:p>
+      <w:pPr>
+        <w:pStyle w:val="H3"/>
+        <w:rPr/>
+      </w:pPr>
+      <w:bookmarkStart w:id="0" w:name="__RefHeading___Toc1130_792013498"/>
+      <w:bookmarkEnd w:id="0"/>
+      <w:r>
+        <w:rPr/>
+        <w:t>Двухпоточний Монтгомері</w:t>
+      </w:r>
+    </w:p>
+    <w:p>
+      <w:pPr>
+        <w:pStyle w:val="P1"/>
+        <w:rPr/>
+      </w:pPr>
+      <w:r>
+        <w:rPr/>
+      </w:r>
+    </w:p>
+    <w:p>
+      <w:pPr>
+        <w:pStyle w:val="img1"/>
+        <w:rPr/>
+      </w:pPr>
+      <w:r>
+        <w:rPr/>
+        <w:drawing>
+          <wp:inline distT="0" distB="0" distL="0" distR="0">
+            <wp:extent cx="3933825" cy="5743575"/>
+            <wp:effectExtent l="0" t="0" r="0" b="0"/>
+            <wp:docPr id="2" name="Зображення3"/>
+            <wp:cNvGraphicFramePr>
+              <a:graphicFrameLocks xmlns:a="http://schemas.openxmlformats.org/drawingml/2006/main" noChangeAspect="1"/>
+            </wp:cNvGraphicFramePr>
+            <a:graphic xmlns:a="http://schemas.openxmlformats.org/drawingml/2006/main">
+              <a:graphicData uri="http://schemas.openxmlformats.org/drawingml/2006/picture">
+                <pic:pic xmlns:pic="http://schemas.openxmlformats.org/drawingml/2006/picture">
+                  <pic:nvPicPr>
+                    <pic:cNvPr id="2" name="Зображення3"/>
+                    <pic:cNvPicPr>
+                      <a:picLocks noChangeAspect="1" noChangeArrowheads="1"/>
+                    </pic:cNvPicPr>
+                  </pic:nvPicPr>
+                  <pic:blipFill>
+                    <a:blip r:embed="rId4">
+                      <a:extLst>
+                        <a:ext uri="{96DAC541-7B7A-43D3-8B79-37D633B846F1}">
+                          <asvg:svgBlip xmlns:asvg="http://schemas.microsoft.com/office/drawing/2016/SVG/main" r:embed="rId5"/>
                         </a:ext>
                       </a:extLst>
                     </a:blip>
@@ -701,7 +745,7 @@
           <wp:inline distT="0" distB="0" distL="0" distR="0">
             <wp:extent cx="2705100" cy="8210550"/>
             <wp:effectExtent l="0" t="0" r="0" b="0"/>
-            <wp:docPr id="2" name="Зображення2"/>
+            <wp:docPr id="3" name="Зображення2"/>
             <wp:cNvGraphicFramePr>
               <a:graphicFrameLocks xmlns:a="http://schemas.openxmlformats.org/drawingml/2006/main" noChangeAspect="1"/>
             </wp:cNvGraphicFramePr>
@@ -709,16 +753,16 @@
               <a:graphicData uri="http://schemas.openxmlformats.org/drawingml/2006/picture">
                 <pic:pic xmlns:pic="http://schemas.openxmlformats.org/drawingml/2006/picture">
                   <pic:nvPicPr>
-                    <pic:cNvPr id="2" name="Зображення2"/>
+                    <pic:cNvPr id="3" name="Зображення2"/>
                     <pic:cNvPicPr>
                       <a:picLocks noChangeAspect="1" noChangeArrowheads="1"/>
                     </pic:cNvPicPr>
                   </pic:nvPicPr>
                   <pic:blipFill>
-                    <a:blip r:embed="rId4">
+                    <a:blip r:embed="rId6">
                       <a:extLst>
                         <a:ext uri="{96DAC541-7B7A-43D3-8B79-37D633B846F1}">
-                          <asvg:svgBlip xmlns:asvg="http://schemas.microsoft.com/office/drawing/2016/SVG/main" r:embed="rId5"/>
+                          <asvg:svgBlip xmlns:asvg="http://schemas.microsoft.com/office/drawing/2016/SVG/main" r:embed="rId7"/>
                         </a:ext>
                       </a:extLst>
                     </a:blip>
@@ -5246,10 +5290,7 @@
       <w:r>
         <w:rPr>
           <w:rFonts w:ascii="Courier New" w:hAnsi="Courier New"/>
-          <w:b w:val="false"/>
-          <w:color w:val="auto"/>
-          <w:sz w:val="21"/>
-          <w:shd w:fill="FFFFFF" w:val="clear"/>
+          <w:color w:val="auto"/>
         </w:rPr>
         <w:t>ui.run(title="ТР2. Алгоритми піднесення до степеня", favicon="📈")</w:t>
       </w:r>
@@ -5578,7 +5619,7 @@
           <wp:inline distT="0" distB="0" distL="0" distR="0">
             <wp:extent cx="5731510" cy="2879725"/>
             <wp:effectExtent l="0" t="0" r="0" b="0"/>
-            <wp:docPr id="3" name="Зображення4"/>
+            <wp:docPr id="4" name="Зображення4"/>
             <wp:cNvGraphicFramePr>
               <a:graphicFrameLocks xmlns:a="http://schemas.openxmlformats.org/drawingml/2006/main" noChangeAspect="1"/>
             </wp:cNvGraphicFramePr>
@@ -5586,13 +5627,13 @@
               <a:graphicData uri="http://schemas.openxmlformats.org/drawingml/2006/picture">
                 <pic:pic xmlns:pic="http://schemas.openxmlformats.org/drawingml/2006/picture">
                   <pic:nvPicPr>
-                    <pic:cNvPr id="3" name="Зображення4"/>
+                    <pic:cNvPr id="4" name="Зображення4"/>
                     <pic:cNvPicPr>
                       <a:picLocks noChangeAspect="1" noChangeArrowheads="1"/>
                     </pic:cNvPicPr>
                   </pic:nvPicPr>
                   <pic:blipFill>
-                    <a:blip r:embed="rId6"/>
+                    <a:blip r:embed="rId8"/>
                     <a:stretch>
                       <a:fillRect/>
                     </a:stretch>
@@ -5675,7 +5716,7 @@
           <wp:inline distT="0" distB="0" distL="0" distR="0">
             <wp:extent cx="5731510" cy="2943225"/>
             <wp:effectExtent l="0" t="0" r="0" b="0"/>
-            <wp:docPr id="4" name="Зображення5"/>
+            <wp:docPr id="5" name="Зображення5"/>
             <wp:cNvGraphicFramePr>
               <a:graphicFrameLocks xmlns:a="http://schemas.openxmlformats.org/drawingml/2006/main" noChangeAspect="1"/>
             </wp:cNvGraphicFramePr>
@@ -5683,13 +5724,13 @@
               <a:graphicData uri="http://schemas.openxmlformats.org/drawingml/2006/picture">
                 <pic:pic xmlns:pic="http://schemas.openxmlformats.org/drawingml/2006/picture">
                   <pic:nvPicPr>
-                    <pic:cNvPr id="4" name="Зображення5"/>
+                    <pic:cNvPr id="5" name="Зображення5"/>
                     <pic:cNvPicPr>
                       <a:picLocks noChangeAspect="1" noChangeArrowheads="1"/>
                     </pic:cNvPicPr>
                   </pic:nvPicPr>
                   <pic:blipFill>
-                    <a:blip r:embed="rId7"/>
+                    <a:blip r:embed="rId9"/>
                     <a:stretch>
                       <a:fillRect/>
                     </a:stretch>
@@ -5764,7 +5805,7 @@
           <wp:inline distT="0" distB="0" distL="0" distR="0">
             <wp:extent cx="5731510" cy="3416935"/>
             <wp:effectExtent l="0" t="0" r="0" b="0"/>
-            <wp:docPr id="5" name="Зображення6"/>
+            <wp:docPr id="6" name="Зображення6"/>
             <wp:cNvGraphicFramePr>
               <a:graphicFrameLocks xmlns:a="http://schemas.openxmlformats.org/drawingml/2006/main" noChangeAspect="1"/>
             </wp:cNvGraphicFramePr>
@@ -5772,13 +5813,13 @@
               <a:graphicData uri="http://schemas.openxmlformats.org/drawingml/2006/picture">
                 <pic:pic xmlns:pic="http://schemas.openxmlformats.org/drawingml/2006/picture">
                   <pic:nvPicPr>
-                    <pic:cNvPr id="5" name="Зображення6"/>
+                    <pic:cNvPr id="6" name="Зображення6"/>
                     <pic:cNvPicPr>
                       <a:picLocks noChangeAspect="1" noChangeArrowheads="1"/>
                     </pic:cNvPicPr>
                   </pic:nvPicPr>
                   <pic:blipFill>
-                    <a:blip r:embed="rId8"/>
+                    <a:blip r:embed="rId10"/>
                     <a:stretch>
                       <a:fillRect/>
                     </a:stretch>
@@ -5865,7 +5906,7 @@
           <wp:inline distT="0" distB="0" distL="0" distR="0">
             <wp:extent cx="5731510" cy="3446145"/>
             <wp:effectExtent l="0" t="0" r="0" b="0"/>
-            <wp:docPr id="6" name="Зображення7"/>
+            <wp:docPr id="7" name="Зображення7"/>
             <wp:cNvGraphicFramePr>
               <a:graphicFrameLocks xmlns:a="http://schemas.openxmlformats.org/drawingml/2006/main" noChangeAspect="1"/>
             </wp:cNvGraphicFramePr>
@@ -5873,13 +5914,13 @@
               <a:graphicData uri="http://schemas.openxmlformats.org/drawingml/2006/picture">
                 <pic:pic xmlns:pic="http://schemas.openxmlformats.org/drawingml/2006/picture">
                   <pic:nvPicPr>
-                    <pic:cNvPr id="6" name="Зображення7"/>
+                    <pic:cNvPr id="7" name="Зображення7"/>
                     <pic:cNvPicPr>
                       <a:picLocks noChangeAspect="1" noChangeArrowheads="1"/>
                     </pic:cNvPicPr>
                   </pic:nvPicPr>
                   <pic:blipFill>
-                    <a:blip r:embed="rId9"/>
+                    <a:blip r:embed="rId11"/>
                     <a:stretch>
                       <a:fillRect/>
                     </a:stretch>
@@ -6550,7 +6591,7 @@
         <w:rPr/>
         <w:t xml:space="preserve">Джерело: </w:t>
       </w:r>
-      <w:hyperlink r:id="rId10">
+      <w:hyperlink r:id="rId12">
         <w:r>
           <w:rPr>
             <w:rStyle w:val="Hyperlink"/>

</xml_diff>